<commit_message>
ROCK2(age by1 04survival and 06geo)
</commit_message>
<xml_diff>
--- a/output/tables/COAD/COAD_cox_multi_APC.docx
+++ b/output/tables/COAD/COAD_cox_multi_APC.docx
@@ -1099,7 +1099,7 @@
                 <w:szCs w:val="18"/>
                 <w:color w:val="000000"/>
               </w:rPr>
-              <w:t xml:space="preserve">1.19 (0.68–2.11)</w:t>
+              <w:t xml:space="preserve">1.13 (0.64–1.99)</w:t>
             </w:r>
           </w:p>
         </w:tc>
@@ -1154,7 +1154,7 @@
                 <w:szCs w:val="18"/>
                 <w:color w:val="000000"/>
               </w:rPr>
-              <w:t xml:space="preserve">0.543</w:t>
+              <w:t xml:space="preserve">0.675</w:t>
             </w:r>
           </w:p>
         </w:tc>
@@ -1269,7 +1269,7 @@
                 <w:szCs w:val="18"/>
                 <w:color w:val="000000"/>
               </w:rPr>
-              <w:t xml:space="preserve">Age group, years</w:t>
+              <w:t xml:space="preserve">Age (per 10 years)</w:t>
             </w:r>
           </w:p>
         </w:tc>
@@ -1324,7 +1324,7 @@
                 <w:szCs w:val="18"/>
                 <w:color w:val="000000"/>
               </w:rPr>
-              <w:t xml:space="preserve">≤65 (ref)</w:t>
+              <w:t xml:space="preserve"/>
             </w:r>
           </w:p>
         </w:tc>
@@ -1379,7 +1379,7 @@
                 <w:szCs w:val="18"/>
                 <w:color w:val="000000"/>
               </w:rPr>
-              <w:t xml:space="preserve">118</w:t>
+              <w:t xml:space="preserve">273</w:t>
             </w:r>
           </w:p>
         </w:tc>
@@ -1434,7 +1434,7 @@
                 <w:szCs w:val="18"/>
                 <w:color w:val="000000"/>
               </w:rPr>
-              <w:t xml:space="preserve">14</w:t>
+              <w:t xml:space="preserve">49</w:t>
             </w:r>
           </w:p>
         </w:tc>
@@ -1489,7 +1489,7 @@
                 <w:szCs w:val="18"/>
                 <w:color w:val="000000"/>
               </w:rPr>
-              <w:t xml:space="preserve">Reference</w:t>
+              <w:t xml:space="preserve">1.04 (1.01–1.06)</w:t>
             </w:r>
           </w:p>
         </w:tc>
@@ -1544,7 +1544,7 @@
                 <w:szCs w:val="18"/>
                 <w:color w:val="000000"/>
               </w:rPr>
-              <w:t xml:space="preserve"/>
+              <w:t xml:space="preserve">0.002</w:t>
             </w:r>
           </w:p>
         </w:tc>
@@ -1659,282 +1659,282 @@
                 <w:szCs w:val="18"/>
                 <w:color w:val="000000"/>
               </w:rPr>
+              <w:t xml:space="preserve">Sex</w:t>
+            </w:r>
+          </w:p>
+        </w:tc>
+        <w:tc>
+          <w:tcPr>
+            <w:tcBorders>
+              <w:bottom w:val="none" w:sz="0" w:space="0" w:color="000000"/>
+              <w:top w:val="none" w:sz="0" w:space="0" w:color="000000"/>
+              <w:left w:val="none" w:sz="0" w:space="0" w:color="000000"/>
+              <w:right w:val="none" w:sz="0" w:space="0" w:color="000000"/>
+            </w:tcBorders>
+            <w:shd w:val="clear" w:color="auto" w:fill="FFFFFF"/>
+            <w:tcMar>
+              <w:top w:w="0" w:type="dxa"/>
+              <w:bottom w:w="0" w:type="dxa"/>
+              <w:left w:w="0" w:type="dxa"/>
+              <w:right w:w="0" w:type="dxa"/>
+            </w:tcMar>
+            <w:vAlign w:val="center"/>
+          </w:tcPr>
+          <w:p>
+            <w:pPr>
+              <w:pStyle w:val="Normal"/>
+              <w:jc w:val="left"/>
+              <w:pBdr>
+                <w:bottom w:val="none" w:sz="0" w:space="0" w:color="000000"/>
+                <w:top w:val="none" w:sz="0" w:space="0" w:color="000000"/>
+                <w:left w:val="none" w:sz="0" w:space="0" w:color="000000"/>
+                <w:right w:val="none" w:sz="0" w:space="0" w:color="000000"/>
+              </w:pBdr>
+              <w:spacing w:after="100" w:before="100" w:line="240"/>
+              <w:ind w:left="100" w:right="100" w:firstLine="0" w:firstLineChars="0"/>
+              <w:rPr>
+                <w:rFonts w:ascii="Times New Roman" w:hAnsi="Times New Roman" w:eastAsia="Times New Roman" w:cs="Times New Roman"/>
+                <w:i w:val="false"/>
+                <w:b w:val="false"/>
+                <w:u w:val="none"/>
+                <w:strike w:val="false"/>
+                <w:sz w:val="18"/>
+                <w:szCs w:val="18"/>
+                <w:color w:val="000000"/>
+              </w:rPr>
+            </w:pPr>
+            <w:r>
+              <w:rPr>
+                <w:rFonts w:ascii="Times New Roman" w:hAnsi="Times New Roman" w:eastAsia="Times New Roman" w:cs="Times New Roman"/>
+                <w:i w:val="false"/>
+                <w:b w:val="false"/>
+                <w:u w:val="none"/>
+                <w:strike w:val="false"/>
+                <w:sz w:val="18"/>
+                <w:szCs w:val="18"/>
+                <w:color w:val="000000"/>
+              </w:rPr>
+              <w:t xml:space="preserve">Male (ref)</w:t>
+            </w:r>
+          </w:p>
+        </w:tc>
+        <w:tc>
+          <w:tcPr>
+            <w:tcBorders>
+              <w:bottom w:val="none" w:sz="0" w:space="0" w:color="000000"/>
+              <w:top w:val="none" w:sz="0" w:space="0" w:color="000000"/>
+              <w:left w:val="none" w:sz="0" w:space="0" w:color="000000"/>
+              <w:right w:val="none" w:sz="0" w:space="0" w:color="000000"/>
+            </w:tcBorders>
+            <w:shd w:val="clear" w:color="auto" w:fill="FFFFFF"/>
+            <w:tcMar>
+              <w:top w:w="0" w:type="dxa"/>
+              <w:bottom w:w="0" w:type="dxa"/>
+              <w:left w:w="0" w:type="dxa"/>
+              <w:right w:w="0" w:type="dxa"/>
+            </w:tcMar>
+            <w:vAlign w:val="center"/>
+          </w:tcPr>
+          <w:p>
+            <w:pPr>
+              <w:pStyle w:val="Normal"/>
+              <w:jc w:val="right"/>
+              <w:pBdr>
+                <w:bottom w:val="none" w:sz="0" w:space="0" w:color="000000"/>
+                <w:top w:val="none" w:sz="0" w:space="0" w:color="000000"/>
+                <w:left w:val="none" w:sz="0" w:space="0" w:color="000000"/>
+                <w:right w:val="none" w:sz="0" w:space="0" w:color="000000"/>
+              </w:pBdr>
+              <w:spacing w:after="100" w:before="100" w:line="240"/>
+              <w:ind w:left="100" w:right="100" w:firstLine="0" w:firstLineChars="0"/>
+              <w:rPr>
+                <w:rFonts w:ascii="Times New Roman" w:hAnsi="Times New Roman" w:eastAsia="Times New Roman" w:cs="Times New Roman"/>
+                <w:i w:val="false"/>
+                <w:b w:val="false"/>
+                <w:u w:val="none"/>
+                <w:strike w:val="false"/>
+                <w:sz w:val="18"/>
+                <w:szCs w:val="18"/>
+                <w:color w:val="000000"/>
+              </w:rPr>
+            </w:pPr>
+            <w:r>
+              <w:rPr>
+                <w:rFonts w:ascii="Times New Roman" w:hAnsi="Times New Roman" w:eastAsia="Times New Roman" w:cs="Times New Roman"/>
+                <w:i w:val="false"/>
+                <w:b w:val="false"/>
+                <w:u w:val="none"/>
+                <w:strike w:val="false"/>
+                <w:sz w:val="18"/>
+                <w:szCs w:val="18"/>
+                <w:color w:val="000000"/>
+              </w:rPr>
+              <w:t xml:space="preserve">141</w:t>
+            </w:r>
+          </w:p>
+        </w:tc>
+        <w:tc>
+          <w:tcPr>
+            <w:tcBorders>
+              <w:bottom w:val="none" w:sz="0" w:space="0" w:color="000000"/>
+              <w:top w:val="none" w:sz="0" w:space="0" w:color="000000"/>
+              <w:left w:val="none" w:sz="0" w:space="0" w:color="000000"/>
+              <w:right w:val="none" w:sz="0" w:space="0" w:color="000000"/>
+            </w:tcBorders>
+            <w:shd w:val="clear" w:color="auto" w:fill="FFFFFF"/>
+            <w:tcMar>
+              <w:top w:w="0" w:type="dxa"/>
+              <w:bottom w:w="0" w:type="dxa"/>
+              <w:left w:w="0" w:type="dxa"/>
+              <w:right w:w="0" w:type="dxa"/>
+            </w:tcMar>
+            <w:vAlign w:val="center"/>
+          </w:tcPr>
+          <w:p>
+            <w:pPr>
+              <w:pStyle w:val="Normal"/>
+              <w:jc w:val="right"/>
+              <w:pBdr>
+                <w:bottom w:val="none" w:sz="0" w:space="0" w:color="000000"/>
+                <w:top w:val="none" w:sz="0" w:space="0" w:color="000000"/>
+                <w:left w:val="none" w:sz="0" w:space="0" w:color="000000"/>
+                <w:right w:val="none" w:sz="0" w:space="0" w:color="000000"/>
+              </w:pBdr>
+              <w:spacing w:after="100" w:before="100" w:line="240"/>
+              <w:ind w:left="100" w:right="100" w:firstLine="0" w:firstLineChars="0"/>
+              <w:rPr>
+                <w:rFonts w:ascii="Times New Roman" w:hAnsi="Times New Roman" w:eastAsia="Times New Roman" w:cs="Times New Roman"/>
+                <w:i w:val="false"/>
+                <w:b w:val="false"/>
+                <w:u w:val="none"/>
+                <w:strike w:val="false"/>
+                <w:sz w:val="18"/>
+                <w:szCs w:val="18"/>
+                <w:color w:val="000000"/>
+              </w:rPr>
+            </w:pPr>
+            <w:r>
+              <w:rPr>
+                <w:rFonts w:ascii="Times New Roman" w:hAnsi="Times New Roman" w:eastAsia="Times New Roman" w:cs="Times New Roman"/>
+                <w:i w:val="false"/>
+                <w:b w:val="false"/>
+                <w:u w:val="none"/>
+                <w:strike w:val="false"/>
+                <w:sz w:val="18"/>
+                <w:szCs w:val="18"/>
+                <w:color w:val="000000"/>
+              </w:rPr>
+              <w:t xml:space="preserve">23</w:t>
+            </w:r>
+          </w:p>
+        </w:tc>
+        <w:tc>
+          <w:tcPr>
+            <w:tcBorders>
+              <w:bottom w:val="none" w:sz="0" w:space="0" w:color="000000"/>
+              <w:top w:val="none" w:sz="0" w:space="0" w:color="000000"/>
+              <w:left w:val="none" w:sz="0" w:space="0" w:color="000000"/>
+              <w:right w:val="none" w:sz="0" w:space="0" w:color="000000"/>
+            </w:tcBorders>
+            <w:shd w:val="clear" w:color="auto" w:fill="FFFFFF"/>
+            <w:tcMar>
+              <w:top w:w="0" w:type="dxa"/>
+              <w:bottom w:w="0" w:type="dxa"/>
+              <w:left w:w="0" w:type="dxa"/>
+              <w:right w:w="0" w:type="dxa"/>
+            </w:tcMar>
+            <w:vAlign w:val="center"/>
+          </w:tcPr>
+          <w:p>
+            <w:pPr>
+              <w:pStyle w:val="Normal"/>
+              <w:jc w:val="left"/>
+              <w:pBdr>
+                <w:bottom w:val="none" w:sz="0" w:space="0" w:color="000000"/>
+                <w:top w:val="none" w:sz="0" w:space="0" w:color="000000"/>
+                <w:left w:val="none" w:sz="0" w:space="0" w:color="000000"/>
+                <w:right w:val="none" w:sz="0" w:space="0" w:color="000000"/>
+              </w:pBdr>
+              <w:spacing w:after="100" w:before="100" w:line="240"/>
+              <w:ind w:left="100" w:right="100" w:firstLine="0" w:firstLineChars="0"/>
+              <w:rPr>
+                <w:rFonts w:ascii="Times New Roman" w:hAnsi="Times New Roman" w:eastAsia="Times New Roman" w:cs="Times New Roman"/>
+                <w:i w:val="false"/>
+                <w:b w:val="false"/>
+                <w:u w:val="none"/>
+                <w:strike w:val="false"/>
+                <w:sz w:val="18"/>
+                <w:szCs w:val="18"/>
+                <w:color w:val="000000"/>
+              </w:rPr>
+            </w:pPr>
+            <w:r>
+              <w:rPr>
+                <w:rFonts w:ascii="Times New Roman" w:hAnsi="Times New Roman" w:eastAsia="Times New Roman" w:cs="Times New Roman"/>
+                <w:i w:val="false"/>
+                <w:b w:val="false"/>
+                <w:u w:val="none"/>
+                <w:strike w:val="false"/>
+                <w:sz w:val="18"/>
+                <w:szCs w:val="18"/>
+                <w:color w:val="000000"/>
+              </w:rPr>
+              <w:t xml:space="preserve">Reference</w:t>
+            </w:r>
+          </w:p>
+        </w:tc>
+        <w:tc>
+          <w:tcPr>
+            <w:tcBorders>
+              <w:bottom w:val="none" w:sz="0" w:space="0" w:color="000000"/>
+              <w:top w:val="none" w:sz="0" w:space="0" w:color="000000"/>
+              <w:left w:val="none" w:sz="0" w:space="0" w:color="000000"/>
+              <w:right w:val="none" w:sz="0" w:space="0" w:color="000000"/>
+            </w:tcBorders>
+            <w:shd w:val="clear" w:color="auto" w:fill="FFFFFF"/>
+            <w:tcMar>
+              <w:top w:w="0" w:type="dxa"/>
+              <w:bottom w:w="0" w:type="dxa"/>
+              <w:left w:w="0" w:type="dxa"/>
+              <w:right w:w="0" w:type="dxa"/>
+            </w:tcMar>
+            <w:vAlign w:val="center"/>
+          </w:tcPr>
+          <w:p>
+            <w:pPr>
+              <w:pStyle w:val="Normal"/>
+              <w:jc w:val="left"/>
+              <w:pBdr>
+                <w:bottom w:val="none" w:sz="0" w:space="0" w:color="000000"/>
+                <w:top w:val="none" w:sz="0" w:space="0" w:color="000000"/>
+                <w:left w:val="none" w:sz="0" w:space="0" w:color="000000"/>
+                <w:right w:val="none" w:sz="0" w:space="0" w:color="000000"/>
+              </w:pBdr>
+              <w:spacing w:after="100" w:before="100" w:line="240"/>
+              <w:ind w:left="100" w:right="100" w:firstLine="0" w:firstLineChars="0"/>
+              <w:rPr>
+                <w:rFonts w:ascii="Times New Roman" w:hAnsi="Times New Roman" w:eastAsia="Times New Roman" w:cs="Times New Roman"/>
+                <w:i w:val="false"/>
+                <w:b w:val="false"/>
+                <w:u w:val="none"/>
+                <w:strike w:val="false"/>
+                <w:sz w:val="18"/>
+                <w:szCs w:val="18"/>
+                <w:color w:val="000000"/>
+              </w:rPr>
+            </w:pPr>
+            <w:r>
+              <w:rPr>
+                <w:rFonts w:ascii="Times New Roman" w:hAnsi="Times New Roman" w:eastAsia="Times New Roman" w:cs="Times New Roman"/>
+                <w:i w:val="false"/>
+                <w:b w:val="false"/>
+                <w:u w:val="none"/>
+                <w:strike w:val="false"/>
+                <w:sz w:val="18"/>
+                <w:szCs w:val="18"/>
+                <w:color w:val="000000"/>
+              </w:rPr>
               <w:t xml:space="preserve"/>
-            </w:r>
-          </w:p>
-        </w:tc>
-        <w:tc>
-          <w:tcPr>
-            <w:tcBorders>
-              <w:bottom w:val="none" w:sz="0" w:space="0" w:color="000000"/>
-              <w:top w:val="none" w:sz="0" w:space="0" w:color="000000"/>
-              <w:left w:val="none" w:sz="0" w:space="0" w:color="000000"/>
-              <w:right w:val="none" w:sz="0" w:space="0" w:color="000000"/>
-            </w:tcBorders>
-            <w:shd w:val="clear" w:color="auto" w:fill="FFFFFF"/>
-            <w:tcMar>
-              <w:top w:w="0" w:type="dxa"/>
-              <w:bottom w:w="0" w:type="dxa"/>
-              <w:left w:w="0" w:type="dxa"/>
-              <w:right w:w="0" w:type="dxa"/>
-            </w:tcMar>
-            <w:vAlign w:val="center"/>
-          </w:tcPr>
-          <w:p>
-            <w:pPr>
-              <w:pStyle w:val="Normal"/>
-              <w:jc w:val="left"/>
-              <w:pBdr>
-                <w:bottom w:val="none" w:sz="0" w:space="0" w:color="000000"/>
-                <w:top w:val="none" w:sz="0" w:space="0" w:color="000000"/>
-                <w:left w:val="none" w:sz="0" w:space="0" w:color="000000"/>
-                <w:right w:val="none" w:sz="0" w:space="0" w:color="000000"/>
-              </w:pBdr>
-              <w:spacing w:after="100" w:before="100" w:line="240"/>
-              <w:ind w:left="100" w:right="100" w:firstLine="0" w:firstLineChars="0"/>
-              <w:rPr>
-                <w:rFonts w:ascii="Times New Roman" w:hAnsi="Times New Roman" w:eastAsia="Times New Roman" w:cs="Times New Roman"/>
-                <w:i w:val="false"/>
-                <w:b w:val="false"/>
-                <w:u w:val="none"/>
-                <w:strike w:val="false"/>
-                <w:sz w:val="18"/>
-                <w:szCs w:val="18"/>
-                <w:color w:val="000000"/>
-              </w:rPr>
-            </w:pPr>
-            <w:r>
-              <w:rPr>
-                <w:rFonts w:ascii="Times New Roman" w:hAnsi="Times New Roman" w:eastAsia="Times New Roman" w:cs="Times New Roman"/>
-                <w:i w:val="false"/>
-                <w:b w:val="false"/>
-                <w:u w:val="none"/>
-                <w:strike w:val="false"/>
-                <w:sz w:val="18"/>
-                <w:szCs w:val="18"/>
-                <w:color w:val="000000"/>
-              </w:rPr>
-              <w:t xml:space="preserve">≥66</w:t>
-            </w:r>
-          </w:p>
-        </w:tc>
-        <w:tc>
-          <w:tcPr>
-            <w:tcBorders>
-              <w:bottom w:val="none" w:sz="0" w:space="0" w:color="000000"/>
-              <w:top w:val="none" w:sz="0" w:space="0" w:color="000000"/>
-              <w:left w:val="none" w:sz="0" w:space="0" w:color="000000"/>
-              <w:right w:val="none" w:sz="0" w:space="0" w:color="000000"/>
-            </w:tcBorders>
-            <w:shd w:val="clear" w:color="auto" w:fill="FFFFFF"/>
-            <w:tcMar>
-              <w:top w:w="0" w:type="dxa"/>
-              <w:bottom w:w="0" w:type="dxa"/>
-              <w:left w:w="0" w:type="dxa"/>
-              <w:right w:w="0" w:type="dxa"/>
-            </w:tcMar>
-            <w:vAlign w:val="center"/>
-          </w:tcPr>
-          <w:p>
-            <w:pPr>
-              <w:pStyle w:val="Normal"/>
-              <w:jc w:val="right"/>
-              <w:pBdr>
-                <w:bottom w:val="none" w:sz="0" w:space="0" w:color="000000"/>
-                <w:top w:val="none" w:sz="0" w:space="0" w:color="000000"/>
-                <w:left w:val="none" w:sz="0" w:space="0" w:color="000000"/>
-                <w:right w:val="none" w:sz="0" w:space="0" w:color="000000"/>
-              </w:pBdr>
-              <w:spacing w:after="100" w:before="100" w:line="240"/>
-              <w:ind w:left="100" w:right="100" w:firstLine="0" w:firstLineChars="0"/>
-              <w:rPr>
-                <w:rFonts w:ascii="Times New Roman" w:hAnsi="Times New Roman" w:eastAsia="Times New Roman" w:cs="Times New Roman"/>
-                <w:i w:val="false"/>
-                <w:b w:val="false"/>
-                <w:u w:val="none"/>
-                <w:strike w:val="false"/>
-                <w:sz w:val="18"/>
-                <w:szCs w:val="18"/>
-                <w:color w:val="000000"/>
-              </w:rPr>
-            </w:pPr>
-            <w:r>
-              <w:rPr>
-                <w:rFonts w:ascii="Times New Roman" w:hAnsi="Times New Roman" w:eastAsia="Times New Roman" w:cs="Times New Roman"/>
-                <w:i w:val="false"/>
-                <w:b w:val="false"/>
-                <w:u w:val="none"/>
-                <w:strike w:val="false"/>
-                <w:sz w:val="18"/>
-                <w:szCs w:val="18"/>
-                <w:color w:val="000000"/>
-              </w:rPr>
-              <w:t xml:space="preserve">155</w:t>
-            </w:r>
-          </w:p>
-        </w:tc>
-        <w:tc>
-          <w:tcPr>
-            <w:tcBorders>
-              <w:bottom w:val="none" w:sz="0" w:space="0" w:color="000000"/>
-              <w:top w:val="none" w:sz="0" w:space="0" w:color="000000"/>
-              <w:left w:val="none" w:sz="0" w:space="0" w:color="000000"/>
-              <w:right w:val="none" w:sz="0" w:space="0" w:color="000000"/>
-            </w:tcBorders>
-            <w:shd w:val="clear" w:color="auto" w:fill="FFFFFF"/>
-            <w:tcMar>
-              <w:top w:w="0" w:type="dxa"/>
-              <w:bottom w:w="0" w:type="dxa"/>
-              <w:left w:w="0" w:type="dxa"/>
-              <w:right w:w="0" w:type="dxa"/>
-            </w:tcMar>
-            <w:vAlign w:val="center"/>
-          </w:tcPr>
-          <w:p>
-            <w:pPr>
-              <w:pStyle w:val="Normal"/>
-              <w:jc w:val="right"/>
-              <w:pBdr>
-                <w:bottom w:val="none" w:sz="0" w:space="0" w:color="000000"/>
-                <w:top w:val="none" w:sz="0" w:space="0" w:color="000000"/>
-                <w:left w:val="none" w:sz="0" w:space="0" w:color="000000"/>
-                <w:right w:val="none" w:sz="0" w:space="0" w:color="000000"/>
-              </w:pBdr>
-              <w:spacing w:after="100" w:before="100" w:line="240"/>
-              <w:ind w:left="100" w:right="100" w:firstLine="0" w:firstLineChars="0"/>
-              <w:rPr>
-                <w:rFonts w:ascii="Times New Roman" w:hAnsi="Times New Roman" w:eastAsia="Times New Roman" w:cs="Times New Roman"/>
-                <w:i w:val="false"/>
-                <w:b w:val="false"/>
-                <w:u w:val="none"/>
-                <w:strike w:val="false"/>
-                <w:sz w:val="18"/>
-                <w:szCs w:val="18"/>
-                <w:color w:val="000000"/>
-              </w:rPr>
-            </w:pPr>
-            <w:r>
-              <w:rPr>
-                <w:rFonts w:ascii="Times New Roman" w:hAnsi="Times New Roman" w:eastAsia="Times New Roman" w:cs="Times New Roman"/>
-                <w:i w:val="false"/>
-                <w:b w:val="false"/>
-                <w:u w:val="none"/>
-                <w:strike w:val="false"/>
-                <w:sz w:val="18"/>
-                <w:szCs w:val="18"/>
-                <w:color w:val="000000"/>
-              </w:rPr>
-              <w:t xml:space="preserve">35</w:t>
-            </w:r>
-          </w:p>
-        </w:tc>
-        <w:tc>
-          <w:tcPr>
-            <w:tcBorders>
-              <w:bottom w:val="none" w:sz="0" w:space="0" w:color="000000"/>
-              <w:top w:val="none" w:sz="0" w:space="0" w:color="000000"/>
-              <w:left w:val="none" w:sz="0" w:space="0" w:color="000000"/>
-              <w:right w:val="none" w:sz="0" w:space="0" w:color="000000"/>
-            </w:tcBorders>
-            <w:shd w:val="clear" w:color="auto" w:fill="FFFFFF"/>
-            <w:tcMar>
-              <w:top w:w="0" w:type="dxa"/>
-              <w:bottom w:w="0" w:type="dxa"/>
-              <w:left w:w="0" w:type="dxa"/>
-              <w:right w:w="0" w:type="dxa"/>
-            </w:tcMar>
-            <w:vAlign w:val="center"/>
-          </w:tcPr>
-          <w:p>
-            <w:pPr>
-              <w:pStyle w:val="Normal"/>
-              <w:jc w:val="left"/>
-              <w:pBdr>
-                <w:bottom w:val="none" w:sz="0" w:space="0" w:color="000000"/>
-                <w:top w:val="none" w:sz="0" w:space="0" w:color="000000"/>
-                <w:left w:val="none" w:sz="0" w:space="0" w:color="000000"/>
-                <w:right w:val="none" w:sz="0" w:space="0" w:color="000000"/>
-              </w:pBdr>
-              <w:spacing w:after="100" w:before="100" w:line="240"/>
-              <w:ind w:left="100" w:right="100" w:firstLine="0" w:firstLineChars="0"/>
-              <w:rPr>
-                <w:rFonts w:ascii="Times New Roman" w:hAnsi="Times New Roman" w:eastAsia="Times New Roman" w:cs="Times New Roman"/>
-                <w:i w:val="false"/>
-                <w:b w:val="false"/>
-                <w:u w:val="none"/>
-                <w:strike w:val="false"/>
-                <w:sz w:val="18"/>
-                <w:szCs w:val="18"/>
-                <w:color w:val="000000"/>
-              </w:rPr>
-            </w:pPr>
-            <w:r>
-              <w:rPr>
-                <w:rFonts w:ascii="Times New Roman" w:hAnsi="Times New Roman" w:eastAsia="Times New Roman" w:cs="Times New Roman"/>
-                <w:i w:val="false"/>
-                <w:b w:val="false"/>
-                <w:u w:val="none"/>
-                <w:strike w:val="false"/>
-                <w:sz w:val="18"/>
-                <w:szCs w:val="18"/>
-                <w:color w:val="000000"/>
-              </w:rPr>
-              <w:t xml:space="preserve">2.62 (1.35–5.07)</w:t>
-            </w:r>
-          </w:p>
-        </w:tc>
-        <w:tc>
-          <w:tcPr>
-            <w:tcBorders>
-              <w:bottom w:val="none" w:sz="0" w:space="0" w:color="000000"/>
-              <w:top w:val="none" w:sz="0" w:space="0" w:color="000000"/>
-              <w:left w:val="none" w:sz="0" w:space="0" w:color="000000"/>
-              <w:right w:val="none" w:sz="0" w:space="0" w:color="000000"/>
-            </w:tcBorders>
-            <w:shd w:val="clear" w:color="auto" w:fill="FFFFFF"/>
-            <w:tcMar>
-              <w:top w:w="0" w:type="dxa"/>
-              <w:bottom w:w="0" w:type="dxa"/>
-              <w:left w:w="0" w:type="dxa"/>
-              <w:right w:w="0" w:type="dxa"/>
-            </w:tcMar>
-            <w:vAlign w:val="center"/>
-          </w:tcPr>
-          <w:p>
-            <w:pPr>
-              <w:pStyle w:val="Normal"/>
-              <w:jc w:val="left"/>
-              <w:pBdr>
-                <w:bottom w:val="none" w:sz="0" w:space="0" w:color="000000"/>
-                <w:top w:val="none" w:sz="0" w:space="0" w:color="000000"/>
-                <w:left w:val="none" w:sz="0" w:space="0" w:color="000000"/>
-                <w:right w:val="none" w:sz="0" w:space="0" w:color="000000"/>
-              </w:pBdr>
-              <w:spacing w:after="100" w:before="100" w:line="240"/>
-              <w:ind w:left="100" w:right="100" w:firstLine="0" w:firstLineChars="0"/>
-              <w:rPr>
-                <w:rFonts w:ascii="Times New Roman" w:hAnsi="Times New Roman" w:eastAsia="Times New Roman" w:cs="Times New Roman"/>
-                <w:i w:val="false"/>
-                <w:b w:val="false"/>
-                <w:u w:val="none"/>
-                <w:strike w:val="false"/>
-                <w:sz w:val="18"/>
-                <w:szCs w:val="18"/>
-                <w:color w:val="000000"/>
-              </w:rPr>
-            </w:pPr>
-            <w:r>
-              <w:rPr>
-                <w:rFonts w:ascii="Times New Roman" w:hAnsi="Times New Roman" w:eastAsia="Times New Roman" w:cs="Times New Roman"/>
-                <w:i w:val="false"/>
-                <w:b w:val="false"/>
-                <w:u w:val="none"/>
-                <w:strike w:val="false"/>
-                <w:sz w:val="18"/>
-                <w:szCs w:val="18"/>
-                <w:color w:val="000000"/>
-              </w:rPr>
-              <w:t xml:space="preserve">0.004</w:t>
             </w:r>
           </w:p>
         </w:tc>
@@ -2049,7 +2049,7 @@
                 <w:szCs w:val="18"/>
                 <w:color w:val="000000"/>
               </w:rPr>
-              <w:t xml:space="preserve">Sex</w:t>
+              <w:t xml:space="preserve"/>
             </w:r>
           </w:p>
         </w:tc>
@@ -2104,7 +2104,7 @@
                 <w:szCs w:val="18"/>
                 <w:color w:val="000000"/>
               </w:rPr>
-              <w:t xml:space="preserve">Male (ref)</w:t>
+              <w:t xml:space="preserve">Female</w:t>
             </w:r>
           </w:p>
         </w:tc>
@@ -2159,7 +2159,7 @@
                 <w:szCs w:val="18"/>
                 <w:color w:val="000000"/>
               </w:rPr>
-              <w:t xml:space="preserve">141</w:t>
+              <w:t xml:space="preserve">132</w:t>
             </w:r>
           </w:p>
         </w:tc>
@@ -2214,7 +2214,7 @@
                 <w:szCs w:val="18"/>
                 <w:color w:val="000000"/>
               </w:rPr>
-              <w:t xml:space="preserve">23</w:t>
+              <w:t xml:space="preserve">26</w:t>
             </w:r>
           </w:p>
         </w:tc>
@@ -2269,7 +2269,7 @@
                 <w:szCs w:val="18"/>
                 <w:color w:val="000000"/>
               </w:rPr>
-              <w:t xml:space="preserve">Reference</w:t>
+              <w:t xml:space="preserve">1.17 (0.66–2.08)</w:t>
             </w:r>
           </w:p>
         </w:tc>
@@ -2324,7 +2324,7 @@
                 <w:szCs w:val="18"/>
                 <w:color w:val="000000"/>
               </w:rPr>
-              <w:t xml:space="preserve"/>
+              <w:t xml:space="preserve">0.590</w:t>
             </w:r>
           </w:p>
         </w:tc>
@@ -2439,282 +2439,282 @@
                 <w:szCs w:val="18"/>
                 <w:color w:val="000000"/>
               </w:rPr>
+              <w:t xml:space="preserve">Pathologic stage group</w:t>
+            </w:r>
+          </w:p>
+        </w:tc>
+        <w:tc>
+          <w:tcPr>
+            <w:tcBorders>
+              <w:bottom w:val="none" w:sz="0" w:space="0" w:color="000000"/>
+              <w:top w:val="none" w:sz="0" w:space="0" w:color="000000"/>
+              <w:left w:val="none" w:sz="0" w:space="0" w:color="000000"/>
+              <w:right w:val="none" w:sz="0" w:space="0" w:color="000000"/>
+            </w:tcBorders>
+            <w:shd w:val="clear" w:color="auto" w:fill="FFFFFF"/>
+            <w:tcMar>
+              <w:top w:w="0" w:type="dxa"/>
+              <w:bottom w:w="0" w:type="dxa"/>
+              <w:left w:w="0" w:type="dxa"/>
+              <w:right w:w="0" w:type="dxa"/>
+            </w:tcMar>
+            <w:vAlign w:val="center"/>
+          </w:tcPr>
+          <w:p>
+            <w:pPr>
+              <w:pStyle w:val="Normal"/>
+              <w:jc w:val="left"/>
+              <w:pBdr>
+                <w:bottom w:val="none" w:sz="0" w:space="0" w:color="000000"/>
+                <w:top w:val="none" w:sz="0" w:space="0" w:color="000000"/>
+                <w:left w:val="none" w:sz="0" w:space="0" w:color="000000"/>
+                <w:right w:val="none" w:sz="0" w:space="0" w:color="000000"/>
+              </w:pBdr>
+              <w:spacing w:after="100" w:before="100" w:line="240"/>
+              <w:ind w:left="100" w:right="100" w:firstLine="0" w:firstLineChars="0"/>
+              <w:rPr>
+                <w:rFonts w:ascii="Times New Roman" w:hAnsi="Times New Roman" w:eastAsia="Times New Roman" w:cs="Times New Roman"/>
+                <w:i w:val="false"/>
+                <w:b w:val="false"/>
+                <w:u w:val="none"/>
+                <w:strike w:val="false"/>
+                <w:sz w:val="18"/>
+                <w:szCs w:val="18"/>
+                <w:color w:val="000000"/>
+              </w:rPr>
+            </w:pPr>
+            <w:r>
+              <w:rPr>
+                <w:rFonts w:ascii="Times New Roman" w:hAnsi="Times New Roman" w:eastAsia="Times New Roman" w:cs="Times New Roman"/>
+                <w:i w:val="false"/>
+                <w:b w:val="false"/>
+                <w:u w:val="none"/>
+                <w:strike w:val="false"/>
+                <w:sz w:val="18"/>
+                <w:szCs w:val="18"/>
+                <w:color w:val="000000"/>
+              </w:rPr>
+              <w:t xml:space="preserve">I–II (ref)</w:t>
+            </w:r>
+          </w:p>
+        </w:tc>
+        <w:tc>
+          <w:tcPr>
+            <w:tcBorders>
+              <w:bottom w:val="none" w:sz="0" w:space="0" w:color="000000"/>
+              <w:top w:val="none" w:sz="0" w:space="0" w:color="000000"/>
+              <w:left w:val="none" w:sz="0" w:space="0" w:color="000000"/>
+              <w:right w:val="none" w:sz="0" w:space="0" w:color="000000"/>
+            </w:tcBorders>
+            <w:shd w:val="clear" w:color="auto" w:fill="FFFFFF"/>
+            <w:tcMar>
+              <w:top w:w="0" w:type="dxa"/>
+              <w:bottom w:w="0" w:type="dxa"/>
+              <w:left w:w="0" w:type="dxa"/>
+              <w:right w:w="0" w:type="dxa"/>
+            </w:tcMar>
+            <w:vAlign w:val="center"/>
+          </w:tcPr>
+          <w:p>
+            <w:pPr>
+              <w:pStyle w:val="Normal"/>
+              <w:jc w:val="right"/>
+              <w:pBdr>
+                <w:bottom w:val="none" w:sz="0" w:space="0" w:color="000000"/>
+                <w:top w:val="none" w:sz="0" w:space="0" w:color="000000"/>
+                <w:left w:val="none" w:sz="0" w:space="0" w:color="000000"/>
+                <w:right w:val="none" w:sz="0" w:space="0" w:color="000000"/>
+              </w:pBdr>
+              <w:spacing w:after="100" w:before="100" w:line="240"/>
+              <w:ind w:left="100" w:right="100" w:firstLine="0" w:firstLineChars="0"/>
+              <w:rPr>
+                <w:rFonts w:ascii="Times New Roman" w:hAnsi="Times New Roman" w:eastAsia="Times New Roman" w:cs="Times New Roman"/>
+                <w:i w:val="false"/>
+                <w:b w:val="false"/>
+                <w:u w:val="none"/>
+                <w:strike w:val="false"/>
+                <w:sz w:val="18"/>
+                <w:szCs w:val="18"/>
+                <w:color w:val="000000"/>
+              </w:rPr>
+            </w:pPr>
+            <w:r>
+              <w:rPr>
+                <w:rFonts w:ascii="Times New Roman" w:hAnsi="Times New Roman" w:eastAsia="Times New Roman" w:cs="Times New Roman"/>
+                <w:i w:val="false"/>
+                <w:b w:val="false"/>
+                <w:u w:val="none"/>
+                <w:strike w:val="false"/>
+                <w:sz w:val="18"/>
+                <w:szCs w:val="18"/>
+                <w:color w:val="000000"/>
+              </w:rPr>
+              <w:t xml:space="preserve">151</w:t>
+            </w:r>
+          </w:p>
+        </w:tc>
+        <w:tc>
+          <w:tcPr>
+            <w:tcBorders>
+              <w:bottom w:val="none" w:sz="0" w:space="0" w:color="000000"/>
+              <w:top w:val="none" w:sz="0" w:space="0" w:color="000000"/>
+              <w:left w:val="none" w:sz="0" w:space="0" w:color="000000"/>
+              <w:right w:val="none" w:sz="0" w:space="0" w:color="000000"/>
+            </w:tcBorders>
+            <w:shd w:val="clear" w:color="auto" w:fill="FFFFFF"/>
+            <w:tcMar>
+              <w:top w:w="0" w:type="dxa"/>
+              <w:bottom w:w="0" w:type="dxa"/>
+              <w:left w:w="0" w:type="dxa"/>
+              <w:right w:w="0" w:type="dxa"/>
+            </w:tcMar>
+            <w:vAlign w:val="center"/>
+          </w:tcPr>
+          <w:p>
+            <w:pPr>
+              <w:pStyle w:val="Normal"/>
+              <w:jc w:val="right"/>
+              <w:pBdr>
+                <w:bottom w:val="none" w:sz="0" w:space="0" w:color="000000"/>
+                <w:top w:val="none" w:sz="0" w:space="0" w:color="000000"/>
+                <w:left w:val="none" w:sz="0" w:space="0" w:color="000000"/>
+                <w:right w:val="none" w:sz="0" w:space="0" w:color="000000"/>
+              </w:pBdr>
+              <w:spacing w:after="100" w:before="100" w:line="240"/>
+              <w:ind w:left="100" w:right="100" w:firstLine="0" w:firstLineChars="0"/>
+              <w:rPr>
+                <w:rFonts w:ascii="Times New Roman" w:hAnsi="Times New Roman" w:eastAsia="Times New Roman" w:cs="Times New Roman"/>
+                <w:i w:val="false"/>
+                <w:b w:val="false"/>
+                <w:u w:val="none"/>
+                <w:strike w:val="false"/>
+                <w:sz w:val="18"/>
+                <w:szCs w:val="18"/>
+                <w:color w:val="000000"/>
+              </w:rPr>
+            </w:pPr>
+            <w:r>
+              <w:rPr>
+                <w:rFonts w:ascii="Times New Roman" w:hAnsi="Times New Roman" w:eastAsia="Times New Roman" w:cs="Times New Roman"/>
+                <w:i w:val="false"/>
+                <w:b w:val="false"/>
+                <w:u w:val="none"/>
+                <w:strike w:val="false"/>
+                <w:sz w:val="18"/>
+                <w:szCs w:val="18"/>
+                <w:color w:val="000000"/>
+              </w:rPr>
+              <w:t xml:space="preserve">16</w:t>
+            </w:r>
+          </w:p>
+        </w:tc>
+        <w:tc>
+          <w:tcPr>
+            <w:tcBorders>
+              <w:bottom w:val="none" w:sz="0" w:space="0" w:color="000000"/>
+              <w:top w:val="none" w:sz="0" w:space="0" w:color="000000"/>
+              <w:left w:val="none" w:sz="0" w:space="0" w:color="000000"/>
+              <w:right w:val="none" w:sz="0" w:space="0" w:color="000000"/>
+            </w:tcBorders>
+            <w:shd w:val="clear" w:color="auto" w:fill="FFFFFF"/>
+            <w:tcMar>
+              <w:top w:w="0" w:type="dxa"/>
+              <w:bottom w:w="0" w:type="dxa"/>
+              <w:left w:w="0" w:type="dxa"/>
+              <w:right w:w="0" w:type="dxa"/>
+            </w:tcMar>
+            <w:vAlign w:val="center"/>
+          </w:tcPr>
+          <w:p>
+            <w:pPr>
+              <w:pStyle w:val="Normal"/>
+              <w:jc w:val="left"/>
+              <w:pBdr>
+                <w:bottom w:val="none" w:sz="0" w:space="0" w:color="000000"/>
+                <w:top w:val="none" w:sz="0" w:space="0" w:color="000000"/>
+                <w:left w:val="none" w:sz="0" w:space="0" w:color="000000"/>
+                <w:right w:val="none" w:sz="0" w:space="0" w:color="000000"/>
+              </w:pBdr>
+              <w:spacing w:after="100" w:before="100" w:line="240"/>
+              <w:ind w:left="100" w:right="100" w:firstLine="0" w:firstLineChars="0"/>
+              <w:rPr>
+                <w:rFonts w:ascii="Times New Roman" w:hAnsi="Times New Roman" w:eastAsia="Times New Roman" w:cs="Times New Roman"/>
+                <w:i w:val="false"/>
+                <w:b w:val="false"/>
+                <w:u w:val="none"/>
+                <w:strike w:val="false"/>
+                <w:sz w:val="18"/>
+                <w:szCs w:val="18"/>
+                <w:color w:val="000000"/>
+              </w:rPr>
+            </w:pPr>
+            <w:r>
+              <w:rPr>
+                <w:rFonts w:ascii="Times New Roman" w:hAnsi="Times New Roman" w:eastAsia="Times New Roman" w:cs="Times New Roman"/>
+                <w:i w:val="false"/>
+                <w:b w:val="false"/>
+                <w:u w:val="none"/>
+                <w:strike w:val="false"/>
+                <w:sz w:val="18"/>
+                <w:szCs w:val="18"/>
+                <w:color w:val="000000"/>
+              </w:rPr>
+              <w:t xml:space="preserve">Reference</w:t>
+            </w:r>
+          </w:p>
+        </w:tc>
+        <w:tc>
+          <w:tcPr>
+            <w:tcBorders>
+              <w:bottom w:val="none" w:sz="0" w:space="0" w:color="000000"/>
+              <w:top w:val="none" w:sz="0" w:space="0" w:color="000000"/>
+              <w:left w:val="none" w:sz="0" w:space="0" w:color="000000"/>
+              <w:right w:val="none" w:sz="0" w:space="0" w:color="000000"/>
+            </w:tcBorders>
+            <w:shd w:val="clear" w:color="auto" w:fill="FFFFFF"/>
+            <w:tcMar>
+              <w:top w:w="0" w:type="dxa"/>
+              <w:bottom w:w="0" w:type="dxa"/>
+              <w:left w:w="0" w:type="dxa"/>
+              <w:right w:w="0" w:type="dxa"/>
+            </w:tcMar>
+            <w:vAlign w:val="center"/>
+          </w:tcPr>
+          <w:p>
+            <w:pPr>
+              <w:pStyle w:val="Normal"/>
+              <w:jc w:val="left"/>
+              <w:pBdr>
+                <w:bottom w:val="none" w:sz="0" w:space="0" w:color="000000"/>
+                <w:top w:val="none" w:sz="0" w:space="0" w:color="000000"/>
+                <w:left w:val="none" w:sz="0" w:space="0" w:color="000000"/>
+                <w:right w:val="none" w:sz="0" w:space="0" w:color="000000"/>
+              </w:pBdr>
+              <w:spacing w:after="100" w:before="100" w:line="240"/>
+              <w:ind w:left="100" w:right="100" w:firstLine="0" w:firstLineChars="0"/>
+              <w:rPr>
+                <w:rFonts w:ascii="Times New Roman" w:hAnsi="Times New Roman" w:eastAsia="Times New Roman" w:cs="Times New Roman"/>
+                <w:i w:val="false"/>
+                <w:b w:val="false"/>
+                <w:u w:val="none"/>
+                <w:strike w:val="false"/>
+                <w:sz w:val="18"/>
+                <w:szCs w:val="18"/>
+                <w:color w:val="000000"/>
+              </w:rPr>
+            </w:pPr>
+            <w:r>
+              <w:rPr>
+                <w:rFonts w:ascii="Times New Roman" w:hAnsi="Times New Roman" w:eastAsia="Times New Roman" w:cs="Times New Roman"/>
+                <w:i w:val="false"/>
+                <w:b w:val="false"/>
+                <w:u w:val="none"/>
+                <w:strike w:val="false"/>
+                <w:sz w:val="18"/>
+                <w:szCs w:val="18"/>
+                <w:color w:val="000000"/>
+              </w:rPr>
               <w:t xml:space="preserve"/>
-            </w:r>
-          </w:p>
-        </w:tc>
-        <w:tc>
-          <w:tcPr>
-            <w:tcBorders>
-              <w:bottom w:val="none" w:sz="0" w:space="0" w:color="000000"/>
-              <w:top w:val="none" w:sz="0" w:space="0" w:color="000000"/>
-              <w:left w:val="none" w:sz="0" w:space="0" w:color="000000"/>
-              <w:right w:val="none" w:sz="0" w:space="0" w:color="000000"/>
-            </w:tcBorders>
-            <w:shd w:val="clear" w:color="auto" w:fill="FFFFFF"/>
-            <w:tcMar>
-              <w:top w:w="0" w:type="dxa"/>
-              <w:bottom w:w="0" w:type="dxa"/>
-              <w:left w:w="0" w:type="dxa"/>
-              <w:right w:w="0" w:type="dxa"/>
-            </w:tcMar>
-            <w:vAlign w:val="center"/>
-          </w:tcPr>
-          <w:p>
-            <w:pPr>
-              <w:pStyle w:val="Normal"/>
-              <w:jc w:val="left"/>
-              <w:pBdr>
-                <w:bottom w:val="none" w:sz="0" w:space="0" w:color="000000"/>
-                <w:top w:val="none" w:sz="0" w:space="0" w:color="000000"/>
-                <w:left w:val="none" w:sz="0" w:space="0" w:color="000000"/>
-                <w:right w:val="none" w:sz="0" w:space="0" w:color="000000"/>
-              </w:pBdr>
-              <w:spacing w:after="100" w:before="100" w:line="240"/>
-              <w:ind w:left="100" w:right="100" w:firstLine="0" w:firstLineChars="0"/>
-              <w:rPr>
-                <w:rFonts w:ascii="Times New Roman" w:hAnsi="Times New Roman" w:eastAsia="Times New Roman" w:cs="Times New Roman"/>
-                <w:i w:val="false"/>
-                <w:b w:val="false"/>
-                <w:u w:val="none"/>
-                <w:strike w:val="false"/>
-                <w:sz w:val="18"/>
-                <w:szCs w:val="18"/>
-                <w:color w:val="000000"/>
-              </w:rPr>
-            </w:pPr>
-            <w:r>
-              <w:rPr>
-                <w:rFonts w:ascii="Times New Roman" w:hAnsi="Times New Roman" w:eastAsia="Times New Roman" w:cs="Times New Roman"/>
-                <w:i w:val="false"/>
-                <w:b w:val="false"/>
-                <w:u w:val="none"/>
-                <w:strike w:val="false"/>
-                <w:sz w:val="18"/>
-                <w:szCs w:val="18"/>
-                <w:color w:val="000000"/>
-              </w:rPr>
-              <w:t xml:space="preserve">Female</w:t>
-            </w:r>
-          </w:p>
-        </w:tc>
-        <w:tc>
-          <w:tcPr>
-            <w:tcBorders>
-              <w:bottom w:val="none" w:sz="0" w:space="0" w:color="000000"/>
-              <w:top w:val="none" w:sz="0" w:space="0" w:color="000000"/>
-              <w:left w:val="none" w:sz="0" w:space="0" w:color="000000"/>
-              <w:right w:val="none" w:sz="0" w:space="0" w:color="000000"/>
-            </w:tcBorders>
-            <w:shd w:val="clear" w:color="auto" w:fill="FFFFFF"/>
-            <w:tcMar>
-              <w:top w:w="0" w:type="dxa"/>
-              <w:bottom w:w="0" w:type="dxa"/>
-              <w:left w:w="0" w:type="dxa"/>
-              <w:right w:w="0" w:type="dxa"/>
-            </w:tcMar>
-            <w:vAlign w:val="center"/>
-          </w:tcPr>
-          <w:p>
-            <w:pPr>
-              <w:pStyle w:val="Normal"/>
-              <w:jc w:val="right"/>
-              <w:pBdr>
-                <w:bottom w:val="none" w:sz="0" w:space="0" w:color="000000"/>
-                <w:top w:val="none" w:sz="0" w:space="0" w:color="000000"/>
-                <w:left w:val="none" w:sz="0" w:space="0" w:color="000000"/>
-                <w:right w:val="none" w:sz="0" w:space="0" w:color="000000"/>
-              </w:pBdr>
-              <w:spacing w:after="100" w:before="100" w:line="240"/>
-              <w:ind w:left="100" w:right="100" w:firstLine="0" w:firstLineChars="0"/>
-              <w:rPr>
-                <w:rFonts w:ascii="Times New Roman" w:hAnsi="Times New Roman" w:eastAsia="Times New Roman" w:cs="Times New Roman"/>
-                <w:i w:val="false"/>
-                <w:b w:val="false"/>
-                <w:u w:val="none"/>
-                <w:strike w:val="false"/>
-                <w:sz w:val="18"/>
-                <w:szCs w:val="18"/>
-                <w:color w:val="000000"/>
-              </w:rPr>
-            </w:pPr>
-            <w:r>
-              <w:rPr>
-                <w:rFonts w:ascii="Times New Roman" w:hAnsi="Times New Roman" w:eastAsia="Times New Roman" w:cs="Times New Roman"/>
-                <w:i w:val="false"/>
-                <w:b w:val="false"/>
-                <w:u w:val="none"/>
-                <w:strike w:val="false"/>
-                <w:sz w:val="18"/>
-                <w:szCs w:val="18"/>
-                <w:color w:val="000000"/>
-              </w:rPr>
-              <w:t xml:space="preserve">132</w:t>
-            </w:r>
-          </w:p>
-        </w:tc>
-        <w:tc>
-          <w:tcPr>
-            <w:tcBorders>
-              <w:bottom w:val="none" w:sz="0" w:space="0" w:color="000000"/>
-              <w:top w:val="none" w:sz="0" w:space="0" w:color="000000"/>
-              <w:left w:val="none" w:sz="0" w:space="0" w:color="000000"/>
-              <w:right w:val="none" w:sz="0" w:space="0" w:color="000000"/>
-            </w:tcBorders>
-            <w:shd w:val="clear" w:color="auto" w:fill="FFFFFF"/>
-            <w:tcMar>
-              <w:top w:w="0" w:type="dxa"/>
-              <w:bottom w:w="0" w:type="dxa"/>
-              <w:left w:w="0" w:type="dxa"/>
-              <w:right w:w="0" w:type="dxa"/>
-            </w:tcMar>
-            <w:vAlign w:val="center"/>
-          </w:tcPr>
-          <w:p>
-            <w:pPr>
-              <w:pStyle w:val="Normal"/>
-              <w:jc w:val="right"/>
-              <w:pBdr>
-                <w:bottom w:val="none" w:sz="0" w:space="0" w:color="000000"/>
-                <w:top w:val="none" w:sz="0" w:space="0" w:color="000000"/>
-                <w:left w:val="none" w:sz="0" w:space="0" w:color="000000"/>
-                <w:right w:val="none" w:sz="0" w:space="0" w:color="000000"/>
-              </w:pBdr>
-              <w:spacing w:after="100" w:before="100" w:line="240"/>
-              <w:ind w:left="100" w:right="100" w:firstLine="0" w:firstLineChars="0"/>
-              <w:rPr>
-                <w:rFonts w:ascii="Times New Roman" w:hAnsi="Times New Roman" w:eastAsia="Times New Roman" w:cs="Times New Roman"/>
-                <w:i w:val="false"/>
-                <w:b w:val="false"/>
-                <w:u w:val="none"/>
-                <w:strike w:val="false"/>
-                <w:sz w:val="18"/>
-                <w:szCs w:val="18"/>
-                <w:color w:val="000000"/>
-              </w:rPr>
-            </w:pPr>
-            <w:r>
-              <w:rPr>
-                <w:rFonts w:ascii="Times New Roman" w:hAnsi="Times New Roman" w:eastAsia="Times New Roman" w:cs="Times New Roman"/>
-                <w:i w:val="false"/>
-                <w:b w:val="false"/>
-                <w:u w:val="none"/>
-                <w:strike w:val="false"/>
-                <w:sz w:val="18"/>
-                <w:szCs w:val="18"/>
-                <w:color w:val="000000"/>
-              </w:rPr>
-              <w:t xml:space="preserve">26</w:t>
-            </w:r>
-          </w:p>
-        </w:tc>
-        <w:tc>
-          <w:tcPr>
-            <w:tcBorders>
-              <w:bottom w:val="none" w:sz="0" w:space="0" w:color="000000"/>
-              <w:top w:val="none" w:sz="0" w:space="0" w:color="000000"/>
-              <w:left w:val="none" w:sz="0" w:space="0" w:color="000000"/>
-              <w:right w:val="none" w:sz="0" w:space="0" w:color="000000"/>
-            </w:tcBorders>
-            <w:shd w:val="clear" w:color="auto" w:fill="FFFFFF"/>
-            <w:tcMar>
-              <w:top w:w="0" w:type="dxa"/>
-              <w:bottom w:w="0" w:type="dxa"/>
-              <w:left w:w="0" w:type="dxa"/>
-              <w:right w:w="0" w:type="dxa"/>
-            </w:tcMar>
-            <w:vAlign w:val="center"/>
-          </w:tcPr>
-          <w:p>
-            <w:pPr>
-              <w:pStyle w:val="Normal"/>
-              <w:jc w:val="left"/>
-              <w:pBdr>
-                <w:bottom w:val="none" w:sz="0" w:space="0" w:color="000000"/>
-                <w:top w:val="none" w:sz="0" w:space="0" w:color="000000"/>
-                <w:left w:val="none" w:sz="0" w:space="0" w:color="000000"/>
-                <w:right w:val="none" w:sz="0" w:space="0" w:color="000000"/>
-              </w:pBdr>
-              <w:spacing w:after="100" w:before="100" w:line="240"/>
-              <w:ind w:left="100" w:right="100" w:firstLine="0" w:firstLineChars="0"/>
-              <w:rPr>
-                <w:rFonts w:ascii="Times New Roman" w:hAnsi="Times New Roman" w:eastAsia="Times New Roman" w:cs="Times New Roman"/>
-                <w:i w:val="false"/>
-                <w:b w:val="false"/>
-                <w:u w:val="none"/>
-                <w:strike w:val="false"/>
-                <w:sz w:val="18"/>
-                <w:szCs w:val="18"/>
-                <w:color w:val="000000"/>
-              </w:rPr>
-            </w:pPr>
-            <w:r>
-              <w:rPr>
-                <w:rFonts w:ascii="Times New Roman" w:hAnsi="Times New Roman" w:eastAsia="Times New Roman" w:cs="Times New Roman"/>
-                <w:i w:val="false"/>
-                <w:b w:val="false"/>
-                <w:u w:val="none"/>
-                <w:strike w:val="false"/>
-                <w:sz w:val="18"/>
-                <w:szCs w:val="18"/>
-                <w:color w:val="000000"/>
-              </w:rPr>
-              <w:t xml:space="preserve">1.22 (0.68–2.17)</w:t>
-            </w:r>
-          </w:p>
-        </w:tc>
-        <w:tc>
-          <w:tcPr>
-            <w:tcBorders>
-              <w:bottom w:val="none" w:sz="0" w:space="0" w:color="000000"/>
-              <w:top w:val="none" w:sz="0" w:space="0" w:color="000000"/>
-              <w:left w:val="none" w:sz="0" w:space="0" w:color="000000"/>
-              <w:right w:val="none" w:sz="0" w:space="0" w:color="000000"/>
-            </w:tcBorders>
-            <w:shd w:val="clear" w:color="auto" w:fill="FFFFFF"/>
-            <w:tcMar>
-              <w:top w:w="0" w:type="dxa"/>
-              <w:bottom w:w="0" w:type="dxa"/>
-              <w:left w:w="0" w:type="dxa"/>
-              <w:right w:w="0" w:type="dxa"/>
-            </w:tcMar>
-            <w:vAlign w:val="center"/>
-          </w:tcPr>
-          <w:p>
-            <w:pPr>
-              <w:pStyle w:val="Normal"/>
-              <w:jc w:val="left"/>
-              <w:pBdr>
-                <w:bottom w:val="none" w:sz="0" w:space="0" w:color="000000"/>
-                <w:top w:val="none" w:sz="0" w:space="0" w:color="000000"/>
-                <w:left w:val="none" w:sz="0" w:space="0" w:color="000000"/>
-                <w:right w:val="none" w:sz="0" w:space="0" w:color="000000"/>
-              </w:pBdr>
-              <w:spacing w:after="100" w:before="100" w:line="240"/>
-              <w:ind w:left="100" w:right="100" w:firstLine="0" w:firstLineChars="0"/>
-              <w:rPr>
-                <w:rFonts w:ascii="Times New Roman" w:hAnsi="Times New Roman" w:eastAsia="Times New Roman" w:cs="Times New Roman"/>
-                <w:i w:val="false"/>
-                <w:b w:val="false"/>
-                <w:u w:val="none"/>
-                <w:strike w:val="false"/>
-                <w:sz w:val="18"/>
-                <w:szCs w:val="18"/>
-                <w:color w:val="000000"/>
-              </w:rPr>
-            </w:pPr>
-            <w:r>
-              <w:rPr>
-                <w:rFonts w:ascii="Times New Roman" w:hAnsi="Times New Roman" w:eastAsia="Times New Roman" w:cs="Times New Roman"/>
-                <w:i w:val="false"/>
-                <w:b w:val="false"/>
-                <w:u w:val="none"/>
-                <w:strike w:val="false"/>
-                <w:sz w:val="18"/>
-                <w:szCs w:val="18"/>
-                <w:color w:val="000000"/>
-              </w:rPr>
-              <w:t xml:space="preserve">0.504</w:t>
             </w:r>
           </w:p>
         </w:tc>
@@ -2829,7 +2829,7 @@
                 <w:szCs w:val="18"/>
                 <w:color w:val="000000"/>
               </w:rPr>
-              <w:t xml:space="preserve">Pathologic stage group</w:t>
+              <w:t xml:space="preserve"/>
             </w:r>
           </w:p>
         </w:tc>
@@ -2884,7 +2884,7 @@
                 <w:szCs w:val="18"/>
                 <w:color w:val="000000"/>
               </w:rPr>
-              <w:t xml:space="preserve">I–II (ref)</w:t>
+              <w:t xml:space="preserve">III–IV</w:t>
             </w:r>
           </w:p>
         </w:tc>
@@ -2939,7 +2939,7 @@
                 <w:szCs w:val="18"/>
                 <w:color w:val="000000"/>
               </w:rPr>
-              <w:t xml:space="preserve">151</w:t>
+              <w:t xml:space="preserve">122</w:t>
             </w:r>
           </w:p>
         </w:tc>
@@ -2994,7 +2994,7 @@
                 <w:szCs w:val="18"/>
                 <w:color w:val="000000"/>
               </w:rPr>
-              <w:t xml:space="preserve">16</w:t>
+              <w:t xml:space="preserve">33</w:t>
             </w:r>
           </w:p>
         </w:tc>
@@ -3049,7 +3049,7 @@
                 <w:szCs w:val="18"/>
                 <w:color w:val="000000"/>
               </w:rPr>
-              <w:t xml:space="preserve">Reference</w:t>
+              <w:t xml:space="preserve">4.09 (2.11–7.94)</w:t>
             </w:r>
           </w:p>
         </w:tc>
@@ -3104,7 +3104,7 @@
                 <w:szCs w:val="18"/>
                 <w:color w:val="000000"/>
               </w:rPr>
-              <w:t xml:space="preserve"/>
+              <w:t xml:space="preserve">&lt;0.001</w:t>
             </w:r>
           </w:p>
         </w:tc>
@@ -3219,396 +3219,6 @@
                 <w:szCs w:val="18"/>
                 <w:color w:val="000000"/>
               </w:rPr>
-              <w:t xml:space="preserve"/>
-            </w:r>
-          </w:p>
-        </w:tc>
-        <w:tc>
-          <w:tcPr>
-            <w:tcBorders>
-              <w:bottom w:val="none" w:sz="0" w:space="0" w:color="000000"/>
-              <w:top w:val="none" w:sz="0" w:space="0" w:color="000000"/>
-              <w:left w:val="none" w:sz="0" w:space="0" w:color="000000"/>
-              <w:right w:val="none" w:sz="0" w:space="0" w:color="000000"/>
-            </w:tcBorders>
-            <w:shd w:val="clear" w:color="auto" w:fill="FFFFFF"/>
-            <w:tcMar>
-              <w:top w:w="0" w:type="dxa"/>
-              <w:bottom w:w="0" w:type="dxa"/>
-              <w:left w:w="0" w:type="dxa"/>
-              <w:right w:w="0" w:type="dxa"/>
-            </w:tcMar>
-            <w:vAlign w:val="center"/>
-          </w:tcPr>
-          <w:p>
-            <w:pPr>
-              <w:pStyle w:val="Normal"/>
-              <w:jc w:val="left"/>
-              <w:pBdr>
-                <w:bottom w:val="none" w:sz="0" w:space="0" w:color="000000"/>
-                <w:top w:val="none" w:sz="0" w:space="0" w:color="000000"/>
-                <w:left w:val="none" w:sz="0" w:space="0" w:color="000000"/>
-                <w:right w:val="none" w:sz="0" w:space="0" w:color="000000"/>
-              </w:pBdr>
-              <w:spacing w:after="100" w:before="100" w:line="240"/>
-              <w:ind w:left="100" w:right="100" w:firstLine="0" w:firstLineChars="0"/>
-              <w:rPr>
-                <w:rFonts w:ascii="Times New Roman" w:hAnsi="Times New Roman" w:eastAsia="Times New Roman" w:cs="Times New Roman"/>
-                <w:i w:val="false"/>
-                <w:b w:val="false"/>
-                <w:u w:val="none"/>
-                <w:strike w:val="false"/>
-                <w:sz w:val="18"/>
-                <w:szCs w:val="18"/>
-                <w:color w:val="000000"/>
-              </w:rPr>
-            </w:pPr>
-            <w:r>
-              <w:rPr>
-                <w:rFonts w:ascii="Times New Roman" w:hAnsi="Times New Roman" w:eastAsia="Times New Roman" w:cs="Times New Roman"/>
-                <w:i w:val="false"/>
-                <w:b w:val="false"/>
-                <w:u w:val="none"/>
-                <w:strike w:val="false"/>
-                <w:sz w:val="18"/>
-                <w:szCs w:val="18"/>
-                <w:color w:val="000000"/>
-              </w:rPr>
-              <w:t xml:space="preserve">III–IV</w:t>
-            </w:r>
-          </w:p>
-        </w:tc>
-        <w:tc>
-          <w:tcPr>
-            <w:tcBorders>
-              <w:bottom w:val="none" w:sz="0" w:space="0" w:color="000000"/>
-              <w:top w:val="none" w:sz="0" w:space="0" w:color="000000"/>
-              <w:left w:val="none" w:sz="0" w:space="0" w:color="000000"/>
-              <w:right w:val="none" w:sz="0" w:space="0" w:color="000000"/>
-            </w:tcBorders>
-            <w:shd w:val="clear" w:color="auto" w:fill="FFFFFF"/>
-            <w:tcMar>
-              <w:top w:w="0" w:type="dxa"/>
-              <w:bottom w:w="0" w:type="dxa"/>
-              <w:left w:w="0" w:type="dxa"/>
-              <w:right w:w="0" w:type="dxa"/>
-            </w:tcMar>
-            <w:vAlign w:val="center"/>
-          </w:tcPr>
-          <w:p>
-            <w:pPr>
-              <w:pStyle w:val="Normal"/>
-              <w:jc w:val="right"/>
-              <w:pBdr>
-                <w:bottom w:val="none" w:sz="0" w:space="0" w:color="000000"/>
-                <w:top w:val="none" w:sz="0" w:space="0" w:color="000000"/>
-                <w:left w:val="none" w:sz="0" w:space="0" w:color="000000"/>
-                <w:right w:val="none" w:sz="0" w:space="0" w:color="000000"/>
-              </w:pBdr>
-              <w:spacing w:after="100" w:before="100" w:line="240"/>
-              <w:ind w:left="100" w:right="100" w:firstLine="0" w:firstLineChars="0"/>
-              <w:rPr>
-                <w:rFonts w:ascii="Times New Roman" w:hAnsi="Times New Roman" w:eastAsia="Times New Roman" w:cs="Times New Roman"/>
-                <w:i w:val="false"/>
-                <w:b w:val="false"/>
-                <w:u w:val="none"/>
-                <w:strike w:val="false"/>
-                <w:sz w:val="18"/>
-                <w:szCs w:val="18"/>
-                <w:color w:val="000000"/>
-              </w:rPr>
-            </w:pPr>
-            <w:r>
-              <w:rPr>
-                <w:rFonts w:ascii="Times New Roman" w:hAnsi="Times New Roman" w:eastAsia="Times New Roman" w:cs="Times New Roman"/>
-                <w:i w:val="false"/>
-                <w:b w:val="false"/>
-                <w:u w:val="none"/>
-                <w:strike w:val="false"/>
-                <w:sz w:val="18"/>
-                <w:szCs w:val="18"/>
-                <w:color w:val="000000"/>
-              </w:rPr>
-              <w:t xml:space="preserve">122</w:t>
-            </w:r>
-          </w:p>
-        </w:tc>
-        <w:tc>
-          <w:tcPr>
-            <w:tcBorders>
-              <w:bottom w:val="none" w:sz="0" w:space="0" w:color="000000"/>
-              <w:top w:val="none" w:sz="0" w:space="0" w:color="000000"/>
-              <w:left w:val="none" w:sz="0" w:space="0" w:color="000000"/>
-              <w:right w:val="none" w:sz="0" w:space="0" w:color="000000"/>
-            </w:tcBorders>
-            <w:shd w:val="clear" w:color="auto" w:fill="FFFFFF"/>
-            <w:tcMar>
-              <w:top w:w="0" w:type="dxa"/>
-              <w:bottom w:w="0" w:type="dxa"/>
-              <w:left w:w="0" w:type="dxa"/>
-              <w:right w:w="0" w:type="dxa"/>
-            </w:tcMar>
-            <w:vAlign w:val="center"/>
-          </w:tcPr>
-          <w:p>
-            <w:pPr>
-              <w:pStyle w:val="Normal"/>
-              <w:jc w:val="right"/>
-              <w:pBdr>
-                <w:bottom w:val="none" w:sz="0" w:space="0" w:color="000000"/>
-                <w:top w:val="none" w:sz="0" w:space="0" w:color="000000"/>
-                <w:left w:val="none" w:sz="0" w:space="0" w:color="000000"/>
-                <w:right w:val="none" w:sz="0" w:space="0" w:color="000000"/>
-              </w:pBdr>
-              <w:spacing w:after="100" w:before="100" w:line="240"/>
-              <w:ind w:left="100" w:right="100" w:firstLine="0" w:firstLineChars="0"/>
-              <w:rPr>
-                <w:rFonts w:ascii="Times New Roman" w:hAnsi="Times New Roman" w:eastAsia="Times New Roman" w:cs="Times New Roman"/>
-                <w:i w:val="false"/>
-                <w:b w:val="false"/>
-                <w:u w:val="none"/>
-                <w:strike w:val="false"/>
-                <w:sz w:val="18"/>
-                <w:szCs w:val="18"/>
-                <w:color w:val="000000"/>
-              </w:rPr>
-            </w:pPr>
-            <w:r>
-              <w:rPr>
-                <w:rFonts w:ascii="Times New Roman" w:hAnsi="Times New Roman" w:eastAsia="Times New Roman" w:cs="Times New Roman"/>
-                <w:i w:val="false"/>
-                <w:b w:val="false"/>
-                <w:u w:val="none"/>
-                <w:strike w:val="false"/>
-                <w:sz w:val="18"/>
-                <w:szCs w:val="18"/>
-                <w:color w:val="000000"/>
-              </w:rPr>
-              <w:t xml:space="preserve">33</w:t>
-            </w:r>
-          </w:p>
-        </w:tc>
-        <w:tc>
-          <w:tcPr>
-            <w:tcBorders>
-              <w:bottom w:val="none" w:sz="0" w:space="0" w:color="000000"/>
-              <w:top w:val="none" w:sz="0" w:space="0" w:color="000000"/>
-              <w:left w:val="none" w:sz="0" w:space="0" w:color="000000"/>
-              <w:right w:val="none" w:sz="0" w:space="0" w:color="000000"/>
-            </w:tcBorders>
-            <w:shd w:val="clear" w:color="auto" w:fill="FFFFFF"/>
-            <w:tcMar>
-              <w:top w:w="0" w:type="dxa"/>
-              <w:bottom w:w="0" w:type="dxa"/>
-              <w:left w:w="0" w:type="dxa"/>
-              <w:right w:w="0" w:type="dxa"/>
-            </w:tcMar>
-            <w:vAlign w:val="center"/>
-          </w:tcPr>
-          <w:p>
-            <w:pPr>
-              <w:pStyle w:val="Normal"/>
-              <w:jc w:val="left"/>
-              <w:pBdr>
-                <w:bottom w:val="none" w:sz="0" w:space="0" w:color="000000"/>
-                <w:top w:val="none" w:sz="0" w:space="0" w:color="000000"/>
-                <w:left w:val="none" w:sz="0" w:space="0" w:color="000000"/>
-                <w:right w:val="none" w:sz="0" w:space="0" w:color="000000"/>
-              </w:pBdr>
-              <w:spacing w:after="100" w:before="100" w:line="240"/>
-              <w:ind w:left="100" w:right="100" w:firstLine="0" w:firstLineChars="0"/>
-              <w:rPr>
-                <w:rFonts w:ascii="Times New Roman" w:hAnsi="Times New Roman" w:eastAsia="Times New Roman" w:cs="Times New Roman"/>
-                <w:i w:val="false"/>
-                <w:b w:val="false"/>
-                <w:u w:val="none"/>
-                <w:strike w:val="false"/>
-                <w:sz w:val="18"/>
-                <w:szCs w:val="18"/>
-                <w:color w:val="000000"/>
-              </w:rPr>
-            </w:pPr>
-            <w:r>
-              <w:rPr>
-                <w:rFonts w:ascii="Times New Roman" w:hAnsi="Times New Roman" w:eastAsia="Times New Roman" w:cs="Times New Roman"/>
-                <w:i w:val="false"/>
-                <w:b w:val="false"/>
-                <w:u w:val="none"/>
-                <w:strike w:val="false"/>
-                <w:sz w:val="18"/>
-                <w:szCs w:val="18"/>
-                <w:color w:val="000000"/>
-              </w:rPr>
-              <w:t xml:space="preserve">3.85 (2.01–7.38)</w:t>
-            </w:r>
-          </w:p>
-        </w:tc>
-        <w:tc>
-          <w:tcPr>
-            <w:tcBorders>
-              <w:bottom w:val="none" w:sz="0" w:space="0" w:color="000000"/>
-              <w:top w:val="none" w:sz="0" w:space="0" w:color="000000"/>
-              <w:left w:val="none" w:sz="0" w:space="0" w:color="000000"/>
-              <w:right w:val="none" w:sz="0" w:space="0" w:color="000000"/>
-            </w:tcBorders>
-            <w:shd w:val="clear" w:color="auto" w:fill="FFFFFF"/>
-            <w:tcMar>
-              <w:top w:w="0" w:type="dxa"/>
-              <w:bottom w:w="0" w:type="dxa"/>
-              <w:left w:w="0" w:type="dxa"/>
-              <w:right w:w="0" w:type="dxa"/>
-            </w:tcMar>
-            <w:vAlign w:val="center"/>
-          </w:tcPr>
-          <w:p>
-            <w:pPr>
-              <w:pStyle w:val="Normal"/>
-              <w:jc w:val="left"/>
-              <w:pBdr>
-                <w:bottom w:val="none" w:sz="0" w:space="0" w:color="000000"/>
-                <w:top w:val="none" w:sz="0" w:space="0" w:color="000000"/>
-                <w:left w:val="none" w:sz="0" w:space="0" w:color="000000"/>
-                <w:right w:val="none" w:sz="0" w:space="0" w:color="000000"/>
-              </w:pBdr>
-              <w:spacing w:after="100" w:before="100" w:line="240"/>
-              <w:ind w:left="100" w:right="100" w:firstLine="0" w:firstLineChars="0"/>
-              <w:rPr>
-                <w:rFonts w:ascii="Times New Roman" w:hAnsi="Times New Roman" w:eastAsia="Times New Roman" w:cs="Times New Roman"/>
-                <w:i w:val="false"/>
-                <w:b w:val="false"/>
-                <w:u w:val="none"/>
-                <w:strike w:val="false"/>
-                <w:sz w:val="18"/>
-                <w:szCs w:val="18"/>
-                <w:color w:val="000000"/>
-              </w:rPr>
-            </w:pPr>
-            <w:r>
-              <w:rPr>
-                <w:rFonts w:ascii="Times New Roman" w:hAnsi="Times New Roman" w:eastAsia="Times New Roman" w:cs="Times New Roman"/>
-                <w:i w:val="false"/>
-                <w:b w:val="false"/>
-                <w:u w:val="none"/>
-                <w:strike w:val="false"/>
-                <w:sz w:val="18"/>
-                <w:szCs w:val="18"/>
-                <w:color w:val="000000"/>
-              </w:rPr>
-              <w:t xml:space="preserve">&lt;0.001</w:t>
-            </w:r>
-          </w:p>
-        </w:tc>
-        <w:tc>
-          <w:tcPr>
-            <w:tcBorders>
-              <w:bottom w:val="none" w:sz="0" w:space="0" w:color="000000"/>
-              <w:top w:val="none" w:sz="0" w:space="0" w:color="000000"/>
-              <w:left w:val="none" w:sz="0" w:space="0" w:color="000000"/>
-              <w:right w:val="none" w:sz="0" w:space="0" w:color="000000"/>
-            </w:tcBorders>
-            <w:shd w:val="clear" w:color="auto" w:fill="FFFFFF"/>
-            <w:tcMar>
-              <w:top w:w="0" w:type="dxa"/>
-              <w:bottom w:w="0" w:type="dxa"/>
-              <w:left w:w="0" w:type="dxa"/>
-              <w:right w:w="0" w:type="dxa"/>
-            </w:tcMar>
-            <w:vAlign w:val="center"/>
-          </w:tcPr>
-          <w:p>
-            <w:pPr>
-              <w:pStyle w:val="Normal"/>
-              <w:jc w:val="left"/>
-              <w:pBdr>
-                <w:bottom w:val="none" w:sz="0" w:space="0" w:color="000000"/>
-                <w:top w:val="none" w:sz="0" w:space="0" w:color="000000"/>
-                <w:left w:val="none" w:sz="0" w:space="0" w:color="000000"/>
-                <w:right w:val="none" w:sz="0" w:space="0" w:color="000000"/>
-              </w:pBdr>
-              <w:spacing w:after="100" w:before="100" w:line="240"/>
-              <w:ind w:left="100" w:right="100" w:firstLine="0" w:firstLineChars="0"/>
-              <w:rPr>
-                <w:rFonts w:ascii="Times New Roman" w:hAnsi="Times New Roman" w:eastAsia="Times New Roman" w:cs="Times New Roman"/>
-                <w:i w:val="false"/>
-                <w:b w:val="false"/>
-                <w:u w:val="none"/>
-                <w:strike w:val="false"/>
-                <w:sz w:val="18"/>
-                <w:szCs w:val="18"/>
-                <w:color w:val="000000"/>
-              </w:rPr>
-            </w:pPr>
-            <w:r>
-              <w:rPr>
-                <w:rFonts w:ascii="Times New Roman" w:hAnsi="Times New Roman" w:eastAsia="Times New Roman" w:cs="Times New Roman"/>
-                <w:i w:val="false"/>
-                <w:b w:val="false"/>
-                <w:u w:val="none"/>
-                <w:strike w:val="false"/>
-                <w:sz w:val="18"/>
-                <w:szCs w:val="18"/>
-                <w:color w:val="000000"/>
-              </w:rPr>
-              <w:t xml:space="preserve"/>
-            </w:r>
-          </w:p>
-        </w:tc>
-      </w:tr>
-      <w:tr>
-        <w:trPr>
-          <w:trHeight w:val="560" w:hRule="auto"/>
-        </w:trPr>
-        <w:tc>
-          <w:tcPr>
-            <w:tcBorders>
-              <w:bottom w:val="none" w:sz="0" w:space="0" w:color="000000"/>
-              <w:top w:val="none" w:sz="0" w:space="0" w:color="000000"/>
-              <w:left w:val="none" w:sz="0" w:space="0" w:color="000000"/>
-              <w:right w:val="none" w:sz="0" w:space="0" w:color="000000"/>
-            </w:tcBorders>
-            <w:shd w:val="clear" w:color="auto" w:fill="FFFFFF"/>
-            <w:tcMar>
-              <w:top w:w="0" w:type="dxa"/>
-              <w:bottom w:w="0" w:type="dxa"/>
-              <w:left w:w="0" w:type="dxa"/>
-              <w:right w:w="0" w:type="dxa"/>
-            </w:tcMar>
-            <w:vAlign w:val="center"/>
-          </w:tcPr>
-          <w:p>
-            <w:pPr>
-              <w:pStyle w:val="Normal"/>
-              <w:jc w:val="left"/>
-              <w:pBdr>
-                <w:bottom w:val="none" w:sz="0" w:space="0" w:color="000000"/>
-                <w:top w:val="none" w:sz="0" w:space="0" w:color="000000"/>
-                <w:left w:val="none" w:sz="0" w:space="0" w:color="000000"/>
-                <w:right w:val="none" w:sz="0" w:space="0" w:color="000000"/>
-              </w:pBdr>
-              <w:spacing w:after="100" w:before="100" w:line="240"/>
-              <w:ind w:left="100" w:right="100" w:firstLine="0" w:firstLineChars="0"/>
-              <w:rPr>
-                <w:rFonts w:ascii="Times New Roman" w:hAnsi="Times New Roman" w:eastAsia="Times New Roman" w:cs="Times New Roman"/>
-                <w:i w:val="false"/>
-                <w:b w:val="false"/>
-                <w:u w:val="none"/>
-                <w:strike w:val="false"/>
-                <w:sz w:val="18"/>
-                <w:szCs w:val="18"/>
-                <w:color w:val="000000"/>
-              </w:rPr>
-            </w:pPr>
-            <w:r>
-              <w:rPr>
-                <w:rFonts w:ascii="Times New Roman" w:hAnsi="Times New Roman" w:eastAsia="Times New Roman" w:cs="Times New Roman"/>
-                <w:i w:val="false"/>
-                <w:b w:val="false"/>
-                <w:u w:val="none"/>
-                <w:strike w:val="false"/>
-                <w:sz w:val="18"/>
-                <w:szCs w:val="18"/>
-                <w:color w:val="000000"/>
-              </w:rPr>
               <w:t xml:space="preserve">Pretreatment CEA</w:t>
             </w:r>
           </w:p>
@@ -4219,7 +3829,7 @@
                 <w:szCs w:val="18"/>
                 <w:color w:val="000000"/>
               </w:rPr>
-              <w:t xml:space="preserve">2.02 (1.13–3.62)</w:t>
+              <w:t xml:space="preserve">2.17 (1.22–3.84)</w:t>
             </w:r>
           </w:p>
         </w:tc>
@@ -4274,7 +3884,7 @@
                 <w:szCs w:val="18"/>
                 <w:color w:val="000000"/>
               </w:rPr>
-              <w:t xml:space="preserve">0.017</w:t>
+              <w:t xml:space="preserve">0.008</w:t>
             </w:r>
           </w:p>
         </w:tc>

</xml_diff>

<commit_message>
Cox gene continuous/caterorical 선택 업데이트
</commit_message>
<xml_diff>
--- a/output/tables/COAD/COAD_cox_multi_APC.docx
+++ b/output/tables/COAD/COAD_cox_multi_APC.docx
@@ -25,7 +25,7 @@
         <w:ind w:left="60" w:right="60" w:firstLine="0" w:firstLineChars="0"/>
       </w:pPr>
       <w:r>
-        <w:t xml:space="preserve">Multivariable Cox regression for overall survival: APC expression, TCGA-COAD (n = 273, events = 49, EPV = 9.8; exploratory)</w:t>
+        <w:t xml:space="preserve">Multivariable Cox regression for overall survival: APC expression, TCGA-COAD (n = 273, events = 49, EPV = 12.2)</w:t>
       </w:r>
     </w:p>
     <w:tbl xmlns:a="http://schemas.openxmlformats.org/drawingml/2006/main" xmlns:pic="http://schemas.openxmlformats.org/drawingml/2006/picture">
@@ -1099,7 +1099,7 @@
                 <w:szCs w:val="18"/>
                 <w:color w:val="000000"/>
               </w:rPr>
-              <w:t xml:space="preserve">1.13 (0.64–1.99)</w:t>
+              <w:t xml:space="preserve">1.12 (0.64–1.98)</w:t>
             </w:r>
           </w:p>
         </w:tc>
@@ -1154,7 +1154,7 @@
                 <w:szCs w:val="18"/>
                 <w:color w:val="000000"/>
               </w:rPr>
-              <w:t xml:space="preserve">0.675</w:t>
+              <w:t xml:space="preserve">0.686</w:t>
             </w:r>
           </w:p>
         </w:tc>
@@ -1269,7 +1269,7 @@
                 <w:szCs w:val="18"/>
                 <w:color w:val="000000"/>
               </w:rPr>
-              <w:t xml:space="preserve">Age (per 10 years)</w:t>
+              <w:t xml:space="preserve">Sex</w:t>
             </w:r>
           </w:p>
         </w:tc>
@@ -1324,7 +1324,7 @@
                 <w:szCs w:val="18"/>
                 <w:color w:val="000000"/>
               </w:rPr>
-              <w:t xml:space="preserve"/>
+              <w:t xml:space="preserve">Male (ref)</w:t>
             </w:r>
           </w:p>
         </w:tc>
@@ -1379,7 +1379,7 @@
                 <w:szCs w:val="18"/>
                 <w:color w:val="000000"/>
               </w:rPr>
-              <w:t xml:space="preserve">273</w:t>
+              <w:t xml:space="preserve">141</w:t>
             </w:r>
           </w:p>
         </w:tc>
@@ -1434,7 +1434,7 @@
                 <w:szCs w:val="18"/>
                 <w:color w:val="000000"/>
               </w:rPr>
-              <w:t xml:space="preserve">49</w:t>
+              <w:t xml:space="preserve">23</w:t>
             </w:r>
           </w:p>
         </w:tc>
@@ -1489,7 +1489,7 @@
                 <w:szCs w:val="18"/>
                 <w:color w:val="000000"/>
               </w:rPr>
-              <w:t xml:space="preserve">1.04 (1.01–1.06)</w:t>
+              <w:t xml:space="preserve">Reference</w:t>
             </w:r>
           </w:p>
         </w:tc>
@@ -1544,7 +1544,7 @@
                 <w:szCs w:val="18"/>
                 <w:color w:val="000000"/>
               </w:rPr>
-              <w:t xml:space="preserve">0.002</w:t>
+              <w:t xml:space="preserve"/>
             </w:r>
           </w:p>
         </w:tc>
@@ -1659,7 +1659,7 @@
                 <w:szCs w:val="18"/>
                 <w:color w:val="000000"/>
               </w:rPr>
-              <w:t xml:space="preserve">Sex</w:t>
+              <w:t xml:space="preserve"/>
             </w:r>
           </w:p>
         </w:tc>
@@ -1714,7 +1714,7 @@
                 <w:szCs w:val="18"/>
                 <w:color w:val="000000"/>
               </w:rPr>
-              <w:t xml:space="preserve">Male (ref)</w:t>
+              <w:t xml:space="preserve">Female</w:t>
             </w:r>
           </w:p>
         </w:tc>
@@ -1769,7 +1769,7 @@
                 <w:szCs w:val="18"/>
                 <w:color w:val="000000"/>
               </w:rPr>
-              <w:t xml:space="preserve">141</w:t>
+              <w:t xml:space="preserve">132</w:t>
             </w:r>
           </w:p>
         </w:tc>
@@ -1824,7 +1824,7 @@
                 <w:szCs w:val="18"/>
                 <w:color w:val="000000"/>
               </w:rPr>
-              <w:t xml:space="preserve">23</w:t>
+              <w:t xml:space="preserve">26</w:t>
             </w:r>
           </w:p>
         </w:tc>
@@ -1879,7 +1879,7 @@
                 <w:szCs w:val="18"/>
                 <w:color w:val="000000"/>
               </w:rPr>
-              <w:t xml:space="preserve">Reference</w:t>
+              <w:t xml:space="preserve">1.04 (0.59–1.85)</w:t>
             </w:r>
           </w:p>
         </w:tc>
@@ -1934,7 +1934,7 @@
                 <w:szCs w:val="18"/>
                 <w:color w:val="000000"/>
               </w:rPr>
-              <w:t xml:space="preserve"/>
+              <w:t xml:space="preserve">0.885</w:t>
             </w:r>
           </w:p>
         </w:tc>
@@ -2049,7 +2049,7 @@
                 <w:szCs w:val="18"/>
                 <w:color w:val="000000"/>
               </w:rPr>
-              <w:t xml:space="preserve"/>
+              <w:t xml:space="preserve">Pathologic stage group</w:t>
             </w:r>
           </w:p>
         </w:tc>
@@ -2104,7 +2104,7 @@
                 <w:szCs w:val="18"/>
                 <w:color w:val="000000"/>
               </w:rPr>
-              <w:t xml:space="preserve">Female</w:t>
+              <w:t xml:space="preserve">I–II (ref)</w:t>
             </w:r>
           </w:p>
         </w:tc>
@@ -2159,7 +2159,7 @@
                 <w:szCs w:val="18"/>
                 <w:color w:val="000000"/>
               </w:rPr>
-              <w:t xml:space="preserve">132</w:t>
+              <w:t xml:space="preserve">151</w:t>
             </w:r>
           </w:p>
         </w:tc>
@@ -2214,7 +2214,7 @@
                 <w:szCs w:val="18"/>
                 <w:color w:val="000000"/>
               </w:rPr>
-              <w:t xml:space="preserve">26</w:t>
+              <w:t xml:space="preserve">16</w:t>
             </w:r>
           </w:p>
         </w:tc>
@@ -2269,7 +2269,7 @@
                 <w:szCs w:val="18"/>
                 <w:color w:val="000000"/>
               </w:rPr>
-              <w:t xml:space="preserve">1.17 (0.66–2.08)</w:t>
+              <w:t xml:space="preserve">Reference</w:t>
             </w:r>
           </w:p>
         </w:tc>
@@ -2324,7 +2324,7 @@
                 <w:szCs w:val="18"/>
                 <w:color w:val="000000"/>
               </w:rPr>
-              <w:t xml:space="preserve">0.590</w:t>
+              <w:t xml:space="preserve"/>
             </w:r>
           </w:p>
         </w:tc>
@@ -2439,7 +2439,7 @@
                 <w:szCs w:val="18"/>
                 <w:color w:val="000000"/>
               </w:rPr>
-              <w:t xml:space="preserve">Pathologic stage group</w:t>
+              <w:t xml:space="preserve"/>
             </w:r>
           </w:p>
         </w:tc>
@@ -2494,7 +2494,7 @@
                 <w:szCs w:val="18"/>
                 <w:color w:val="000000"/>
               </w:rPr>
-              <w:t xml:space="preserve">I–II (ref)</w:t>
+              <w:t xml:space="preserve">III–IV</w:t>
             </w:r>
           </w:p>
         </w:tc>
@@ -2549,7 +2549,7 @@
                 <w:szCs w:val="18"/>
                 <w:color w:val="000000"/>
               </w:rPr>
-              <w:t xml:space="preserve">151</w:t>
+              <w:t xml:space="preserve">122</w:t>
             </w:r>
           </w:p>
         </w:tc>
@@ -2604,7 +2604,7 @@
                 <w:szCs w:val="18"/>
                 <w:color w:val="000000"/>
               </w:rPr>
-              <w:t xml:space="preserve">16</w:t>
+              <w:t xml:space="preserve">33</w:t>
             </w:r>
           </w:p>
         </w:tc>
@@ -2659,7 +2659,7 @@
                 <w:szCs w:val="18"/>
                 <w:color w:val="000000"/>
               </w:rPr>
-              <w:t xml:space="preserve">Reference</w:t>
+              <w:t xml:space="preserve">2.86 (1.54–5.29)</w:t>
             </w:r>
           </w:p>
         </w:tc>
@@ -2714,7 +2714,7 @@
                 <w:szCs w:val="18"/>
                 <w:color w:val="000000"/>
               </w:rPr>
-              <w:t xml:space="preserve"/>
+              <w:t xml:space="preserve">&lt;0.001</w:t>
             </w:r>
           </w:p>
         </w:tc>
@@ -2829,396 +2829,6 @@
                 <w:szCs w:val="18"/>
                 <w:color w:val="000000"/>
               </w:rPr>
-              <w:t xml:space="preserve"/>
-            </w:r>
-          </w:p>
-        </w:tc>
-        <w:tc>
-          <w:tcPr>
-            <w:tcBorders>
-              <w:bottom w:val="none" w:sz="0" w:space="0" w:color="000000"/>
-              <w:top w:val="none" w:sz="0" w:space="0" w:color="000000"/>
-              <w:left w:val="none" w:sz="0" w:space="0" w:color="000000"/>
-              <w:right w:val="none" w:sz="0" w:space="0" w:color="000000"/>
-            </w:tcBorders>
-            <w:shd w:val="clear" w:color="auto" w:fill="FFFFFF"/>
-            <w:tcMar>
-              <w:top w:w="0" w:type="dxa"/>
-              <w:bottom w:w="0" w:type="dxa"/>
-              <w:left w:w="0" w:type="dxa"/>
-              <w:right w:w="0" w:type="dxa"/>
-            </w:tcMar>
-            <w:vAlign w:val="center"/>
-          </w:tcPr>
-          <w:p>
-            <w:pPr>
-              <w:pStyle w:val="Normal"/>
-              <w:jc w:val="left"/>
-              <w:pBdr>
-                <w:bottom w:val="none" w:sz="0" w:space="0" w:color="000000"/>
-                <w:top w:val="none" w:sz="0" w:space="0" w:color="000000"/>
-                <w:left w:val="none" w:sz="0" w:space="0" w:color="000000"/>
-                <w:right w:val="none" w:sz="0" w:space="0" w:color="000000"/>
-              </w:pBdr>
-              <w:spacing w:after="100" w:before="100" w:line="240"/>
-              <w:ind w:left="100" w:right="100" w:firstLine="0" w:firstLineChars="0"/>
-              <w:rPr>
-                <w:rFonts w:ascii="Times New Roman" w:hAnsi="Times New Roman" w:eastAsia="Times New Roman" w:cs="Times New Roman"/>
-                <w:i w:val="false"/>
-                <w:b w:val="false"/>
-                <w:u w:val="none"/>
-                <w:strike w:val="false"/>
-                <w:sz w:val="18"/>
-                <w:szCs w:val="18"/>
-                <w:color w:val="000000"/>
-              </w:rPr>
-            </w:pPr>
-            <w:r>
-              <w:rPr>
-                <w:rFonts w:ascii="Times New Roman" w:hAnsi="Times New Roman" w:eastAsia="Times New Roman" w:cs="Times New Roman"/>
-                <w:i w:val="false"/>
-                <w:b w:val="false"/>
-                <w:u w:val="none"/>
-                <w:strike w:val="false"/>
-                <w:sz w:val="18"/>
-                <w:szCs w:val="18"/>
-                <w:color w:val="000000"/>
-              </w:rPr>
-              <w:t xml:space="preserve">III–IV</w:t>
-            </w:r>
-          </w:p>
-        </w:tc>
-        <w:tc>
-          <w:tcPr>
-            <w:tcBorders>
-              <w:bottom w:val="none" w:sz="0" w:space="0" w:color="000000"/>
-              <w:top w:val="none" w:sz="0" w:space="0" w:color="000000"/>
-              <w:left w:val="none" w:sz="0" w:space="0" w:color="000000"/>
-              <w:right w:val="none" w:sz="0" w:space="0" w:color="000000"/>
-            </w:tcBorders>
-            <w:shd w:val="clear" w:color="auto" w:fill="FFFFFF"/>
-            <w:tcMar>
-              <w:top w:w="0" w:type="dxa"/>
-              <w:bottom w:w="0" w:type="dxa"/>
-              <w:left w:w="0" w:type="dxa"/>
-              <w:right w:w="0" w:type="dxa"/>
-            </w:tcMar>
-            <w:vAlign w:val="center"/>
-          </w:tcPr>
-          <w:p>
-            <w:pPr>
-              <w:pStyle w:val="Normal"/>
-              <w:jc w:val="right"/>
-              <w:pBdr>
-                <w:bottom w:val="none" w:sz="0" w:space="0" w:color="000000"/>
-                <w:top w:val="none" w:sz="0" w:space="0" w:color="000000"/>
-                <w:left w:val="none" w:sz="0" w:space="0" w:color="000000"/>
-                <w:right w:val="none" w:sz="0" w:space="0" w:color="000000"/>
-              </w:pBdr>
-              <w:spacing w:after="100" w:before="100" w:line="240"/>
-              <w:ind w:left="100" w:right="100" w:firstLine="0" w:firstLineChars="0"/>
-              <w:rPr>
-                <w:rFonts w:ascii="Times New Roman" w:hAnsi="Times New Roman" w:eastAsia="Times New Roman" w:cs="Times New Roman"/>
-                <w:i w:val="false"/>
-                <w:b w:val="false"/>
-                <w:u w:val="none"/>
-                <w:strike w:val="false"/>
-                <w:sz w:val="18"/>
-                <w:szCs w:val="18"/>
-                <w:color w:val="000000"/>
-              </w:rPr>
-            </w:pPr>
-            <w:r>
-              <w:rPr>
-                <w:rFonts w:ascii="Times New Roman" w:hAnsi="Times New Roman" w:eastAsia="Times New Roman" w:cs="Times New Roman"/>
-                <w:i w:val="false"/>
-                <w:b w:val="false"/>
-                <w:u w:val="none"/>
-                <w:strike w:val="false"/>
-                <w:sz w:val="18"/>
-                <w:szCs w:val="18"/>
-                <w:color w:val="000000"/>
-              </w:rPr>
-              <w:t xml:space="preserve">122</w:t>
-            </w:r>
-          </w:p>
-        </w:tc>
-        <w:tc>
-          <w:tcPr>
-            <w:tcBorders>
-              <w:bottom w:val="none" w:sz="0" w:space="0" w:color="000000"/>
-              <w:top w:val="none" w:sz="0" w:space="0" w:color="000000"/>
-              <w:left w:val="none" w:sz="0" w:space="0" w:color="000000"/>
-              <w:right w:val="none" w:sz="0" w:space="0" w:color="000000"/>
-            </w:tcBorders>
-            <w:shd w:val="clear" w:color="auto" w:fill="FFFFFF"/>
-            <w:tcMar>
-              <w:top w:w="0" w:type="dxa"/>
-              <w:bottom w:w="0" w:type="dxa"/>
-              <w:left w:w="0" w:type="dxa"/>
-              <w:right w:w="0" w:type="dxa"/>
-            </w:tcMar>
-            <w:vAlign w:val="center"/>
-          </w:tcPr>
-          <w:p>
-            <w:pPr>
-              <w:pStyle w:val="Normal"/>
-              <w:jc w:val="right"/>
-              <w:pBdr>
-                <w:bottom w:val="none" w:sz="0" w:space="0" w:color="000000"/>
-                <w:top w:val="none" w:sz="0" w:space="0" w:color="000000"/>
-                <w:left w:val="none" w:sz="0" w:space="0" w:color="000000"/>
-                <w:right w:val="none" w:sz="0" w:space="0" w:color="000000"/>
-              </w:pBdr>
-              <w:spacing w:after="100" w:before="100" w:line="240"/>
-              <w:ind w:left="100" w:right="100" w:firstLine="0" w:firstLineChars="0"/>
-              <w:rPr>
-                <w:rFonts w:ascii="Times New Roman" w:hAnsi="Times New Roman" w:eastAsia="Times New Roman" w:cs="Times New Roman"/>
-                <w:i w:val="false"/>
-                <w:b w:val="false"/>
-                <w:u w:val="none"/>
-                <w:strike w:val="false"/>
-                <w:sz w:val="18"/>
-                <w:szCs w:val="18"/>
-                <w:color w:val="000000"/>
-              </w:rPr>
-            </w:pPr>
-            <w:r>
-              <w:rPr>
-                <w:rFonts w:ascii="Times New Roman" w:hAnsi="Times New Roman" w:eastAsia="Times New Roman" w:cs="Times New Roman"/>
-                <w:i w:val="false"/>
-                <w:b w:val="false"/>
-                <w:u w:val="none"/>
-                <w:strike w:val="false"/>
-                <w:sz w:val="18"/>
-                <w:szCs w:val="18"/>
-                <w:color w:val="000000"/>
-              </w:rPr>
-              <w:t xml:space="preserve">33</w:t>
-            </w:r>
-          </w:p>
-        </w:tc>
-        <w:tc>
-          <w:tcPr>
-            <w:tcBorders>
-              <w:bottom w:val="none" w:sz="0" w:space="0" w:color="000000"/>
-              <w:top w:val="none" w:sz="0" w:space="0" w:color="000000"/>
-              <w:left w:val="none" w:sz="0" w:space="0" w:color="000000"/>
-              <w:right w:val="none" w:sz="0" w:space="0" w:color="000000"/>
-            </w:tcBorders>
-            <w:shd w:val="clear" w:color="auto" w:fill="FFFFFF"/>
-            <w:tcMar>
-              <w:top w:w="0" w:type="dxa"/>
-              <w:bottom w:w="0" w:type="dxa"/>
-              <w:left w:w="0" w:type="dxa"/>
-              <w:right w:w="0" w:type="dxa"/>
-            </w:tcMar>
-            <w:vAlign w:val="center"/>
-          </w:tcPr>
-          <w:p>
-            <w:pPr>
-              <w:pStyle w:val="Normal"/>
-              <w:jc w:val="left"/>
-              <w:pBdr>
-                <w:bottom w:val="none" w:sz="0" w:space="0" w:color="000000"/>
-                <w:top w:val="none" w:sz="0" w:space="0" w:color="000000"/>
-                <w:left w:val="none" w:sz="0" w:space="0" w:color="000000"/>
-                <w:right w:val="none" w:sz="0" w:space="0" w:color="000000"/>
-              </w:pBdr>
-              <w:spacing w:after="100" w:before="100" w:line="240"/>
-              <w:ind w:left="100" w:right="100" w:firstLine="0" w:firstLineChars="0"/>
-              <w:rPr>
-                <w:rFonts w:ascii="Times New Roman" w:hAnsi="Times New Roman" w:eastAsia="Times New Roman" w:cs="Times New Roman"/>
-                <w:i w:val="false"/>
-                <w:b w:val="false"/>
-                <w:u w:val="none"/>
-                <w:strike w:val="false"/>
-                <w:sz w:val="18"/>
-                <w:szCs w:val="18"/>
-                <w:color w:val="000000"/>
-              </w:rPr>
-            </w:pPr>
-            <w:r>
-              <w:rPr>
-                <w:rFonts w:ascii="Times New Roman" w:hAnsi="Times New Roman" w:eastAsia="Times New Roman" w:cs="Times New Roman"/>
-                <w:i w:val="false"/>
-                <w:b w:val="false"/>
-                <w:u w:val="none"/>
-                <w:strike w:val="false"/>
-                <w:sz w:val="18"/>
-                <w:szCs w:val="18"/>
-                <w:color w:val="000000"/>
-              </w:rPr>
-              <w:t xml:space="preserve">4.09 (2.11–7.94)</w:t>
-            </w:r>
-          </w:p>
-        </w:tc>
-        <w:tc>
-          <w:tcPr>
-            <w:tcBorders>
-              <w:bottom w:val="none" w:sz="0" w:space="0" w:color="000000"/>
-              <w:top w:val="none" w:sz="0" w:space="0" w:color="000000"/>
-              <w:left w:val="none" w:sz="0" w:space="0" w:color="000000"/>
-              <w:right w:val="none" w:sz="0" w:space="0" w:color="000000"/>
-            </w:tcBorders>
-            <w:shd w:val="clear" w:color="auto" w:fill="FFFFFF"/>
-            <w:tcMar>
-              <w:top w:w="0" w:type="dxa"/>
-              <w:bottom w:w="0" w:type="dxa"/>
-              <w:left w:w="0" w:type="dxa"/>
-              <w:right w:w="0" w:type="dxa"/>
-            </w:tcMar>
-            <w:vAlign w:val="center"/>
-          </w:tcPr>
-          <w:p>
-            <w:pPr>
-              <w:pStyle w:val="Normal"/>
-              <w:jc w:val="left"/>
-              <w:pBdr>
-                <w:bottom w:val="none" w:sz="0" w:space="0" w:color="000000"/>
-                <w:top w:val="none" w:sz="0" w:space="0" w:color="000000"/>
-                <w:left w:val="none" w:sz="0" w:space="0" w:color="000000"/>
-                <w:right w:val="none" w:sz="0" w:space="0" w:color="000000"/>
-              </w:pBdr>
-              <w:spacing w:after="100" w:before="100" w:line="240"/>
-              <w:ind w:left="100" w:right="100" w:firstLine="0" w:firstLineChars="0"/>
-              <w:rPr>
-                <w:rFonts w:ascii="Times New Roman" w:hAnsi="Times New Roman" w:eastAsia="Times New Roman" w:cs="Times New Roman"/>
-                <w:i w:val="false"/>
-                <w:b w:val="false"/>
-                <w:u w:val="none"/>
-                <w:strike w:val="false"/>
-                <w:sz w:val="18"/>
-                <w:szCs w:val="18"/>
-                <w:color w:val="000000"/>
-              </w:rPr>
-            </w:pPr>
-            <w:r>
-              <w:rPr>
-                <w:rFonts w:ascii="Times New Roman" w:hAnsi="Times New Roman" w:eastAsia="Times New Roman" w:cs="Times New Roman"/>
-                <w:i w:val="false"/>
-                <w:b w:val="false"/>
-                <w:u w:val="none"/>
-                <w:strike w:val="false"/>
-                <w:sz w:val="18"/>
-                <w:szCs w:val="18"/>
-                <w:color w:val="000000"/>
-              </w:rPr>
-              <w:t xml:space="preserve">&lt;0.001</w:t>
-            </w:r>
-          </w:p>
-        </w:tc>
-        <w:tc>
-          <w:tcPr>
-            <w:tcBorders>
-              <w:bottom w:val="none" w:sz="0" w:space="0" w:color="000000"/>
-              <w:top w:val="none" w:sz="0" w:space="0" w:color="000000"/>
-              <w:left w:val="none" w:sz="0" w:space="0" w:color="000000"/>
-              <w:right w:val="none" w:sz="0" w:space="0" w:color="000000"/>
-            </w:tcBorders>
-            <w:shd w:val="clear" w:color="auto" w:fill="FFFFFF"/>
-            <w:tcMar>
-              <w:top w:w="0" w:type="dxa"/>
-              <w:bottom w:w="0" w:type="dxa"/>
-              <w:left w:w="0" w:type="dxa"/>
-              <w:right w:w="0" w:type="dxa"/>
-            </w:tcMar>
-            <w:vAlign w:val="center"/>
-          </w:tcPr>
-          <w:p>
-            <w:pPr>
-              <w:pStyle w:val="Normal"/>
-              <w:jc w:val="left"/>
-              <w:pBdr>
-                <w:bottom w:val="none" w:sz="0" w:space="0" w:color="000000"/>
-                <w:top w:val="none" w:sz="0" w:space="0" w:color="000000"/>
-                <w:left w:val="none" w:sz="0" w:space="0" w:color="000000"/>
-                <w:right w:val="none" w:sz="0" w:space="0" w:color="000000"/>
-              </w:pBdr>
-              <w:spacing w:after="100" w:before="100" w:line="240"/>
-              <w:ind w:left="100" w:right="100" w:firstLine="0" w:firstLineChars="0"/>
-              <w:rPr>
-                <w:rFonts w:ascii="Times New Roman" w:hAnsi="Times New Roman" w:eastAsia="Times New Roman" w:cs="Times New Roman"/>
-                <w:i w:val="false"/>
-                <w:b w:val="false"/>
-                <w:u w:val="none"/>
-                <w:strike w:val="false"/>
-                <w:sz w:val="18"/>
-                <w:szCs w:val="18"/>
-                <w:color w:val="000000"/>
-              </w:rPr>
-            </w:pPr>
-            <w:r>
-              <w:rPr>
-                <w:rFonts w:ascii="Times New Roman" w:hAnsi="Times New Roman" w:eastAsia="Times New Roman" w:cs="Times New Roman"/>
-                <w:i w:val="false"/>
-                <w:b w:val="false"/>
-                <w:u w:val="none"/>
-                <w:strike w:val="false"/>
-                <w:sz w:val="18"/>
-                <w:szCs w:val="18"/>
-                <w:color w:val="000000"/>
-              </w:rPr>
-              <w:t xml:space="preserve"/>
-            </w:r>
-          </w:p>
-        </w:tc>
-      </w:tr>
-      <w:tr>
-        <w:trPr>
-          <w:trHeight w:val="560" w:hRule="auto"/>
-        </w:trPr>
-        <w:tc>
-          <w:tcPr>
-            <w:tcBorders>
-              <w:bottom w:val="none" w:sz="0" w:space="0" w:color="000000"/>
-              <w:top w:val="none" w:sz="0" w:space="0" w:color="000000"/>
-              <w:left w:val="none" w:sz="0" w:space="0" w:color="000000"/>
-              <w:right w:val="none" w:sz="0" w:space="0" w:color="000000"/>
-            </w:tcBorders>
-            <w:shd w:val="clear" w:color="auto" w:fill="FFFFFF"/>
-            <w:tcMar>
-              <w:top w:w="0" w:type="dxa"/>
-              <w:bottom w:w="0" w:type="dxa"/>
-              <w:left w:w="0" w:type="dxa"/>
-              <w:right w:w="0" w:type="dxa"/>
-            </w:tcMar>
-            <w:vAlign w:val="center"/>
-          </w:tcPr>
-          <w:p>
-            <w:pPr>
-              <w:pStyle w:val="Normal"/>
-              <w:jc w:val="left"/>
-              <w:pBdr>
-                <w:bottom w:val="none" w:sz="0" w:space="0" w:color="000000"/>
-                <w:top w:val="none" w:sz="0" w:space="0" w:color="000000"/>
-                <w:left w:val="none" w:sz="0" w:space="0" w:color="000000"/>
-                <w:right w:val="none" w:sz="0" w:space="0" w:color="000000"/>
-              </w:pBdr>
-              <w:spacing w:after="100" w:before="100" w:line="240"/>
-              <w:ind w:left="100" w:right="100" w:firstLine="0" w:firstLineChars="0"/>
-              <w:rPr>
-                <w:rFonts w:ascii="Times New Roman" w:hAnsi="Times New Roman" w:eastAsia="Times New Roman" w:cs="Times New Roman"/>
-                <w:i w:val="false"/>
-                <w:b w:val="false"/>
-                <w:u w:val="none"/>
-                <w:strike w:val="false"/>
-                <w:sz w:val="18"/>
-                <w:szCs w:val="18"/>
-                <w:color w:val="000000"/>
-              </w:rPr>
-            </w:pPr>
-            <w:r>
-              <w:rPr>
-                <w:rFonts w:ascii="Times New Roman" w:hAnsi="Times New Roman" w:eastAsia="Times New Roman" w:cs="Times New Roman"/>
-                <w:i w:val="false"/>
-                <w:b w:val="false"/>
-                <w:u w:val="none"/>
-                <w:strike w:val="false"/>
-                <w:sz w:val="18"/>
-                <w:szCs w:val="18"/>
-                <w:color w:val="000000"/>
-              </w:rPr>
               <w:t xml:space="preserve">Pretreatment CEA</w:t>
             </w:r>
           </w:p>
@@ -3829,7 +3439,7 @@
                 <w:szCs w:val="18"/>
                 <w:color w:val="000000"/>
               </w:rPr>
-              <w:t xml:space="preserve">2.17 (1.22–3.84)</w:t>
+              <w:t xml:space="preserve">2.27 (1.27–4.06)</w:t>
             </w:r>
           </w:p>
         </w:tc>
@@ -3884,7 +3494,7 @@
                 <w:szCs w:val="18"/>
                 <w:color w:val="000000"/>
               </w:rPr>
-              <w:t xml:space="preserve">0.008</w:t>
+              <w:t xml:space="preserve">0.005</w:t>
             </w:r>
           </w:p>
         </w:tc>

</xml_diff>